<commit_message>
Tuần 06, bài 123
</commit_message>
<xml_diff>
--- a/NguyenVanAnhDuc_Tuan04/NguyenVanAnhDuc_2304871.docx
+++ b/NguyenVanAnhDuc_Tuan04/NguyenVanAnhDuc_2304871.docx
@@ -49,6 +49,28 @@
       <w:r>
         <w:t xml:space="preserve">: </w:t>
       </w:r>
+      <w:hyperlink r:id="rId4" w:history="1">
+        <w:r>
+          <w:rPr>
+            <w:rStyle w:val="Hyperlink"/>
+          </w:rPr>
+          <w:t>https://github.com/dickese/Mobile/tree/main/NguyenVanAn</w:t>
+        </w:r>
+        <w:bookmarkStart w:id="0" w:name="_GoBack"/>
+        <w:bookmarkEnd w:id="0"/>
+        <w:r>
+          <w:rPr>
+            <w:rStyle w:val="Hyperlink"/>
+          </w:rPr>
+          <w:t>h</w:t>
+        </w:r>
+        <w:r>
+          <w:rPr>
+            <w:rStyle w:val="Hyperlink"/>
+          </w:rPr>
+          <w:t>Duc_Tuan04</w:t>
+        </w:r>
+      </w:hyperlink>
     </w:p>
     <w:p>
       <w:pPr>
@@ -612,841 +634,17 @@
         <w:t>.</w:t>
       </w:r>
     </w:p>
+    <w:p/>
     <w:p>
-      <w:bookmarkStart w:id="0" w:name="_GoBack"/>
-      <w:bookmarkEnd w:id="0"/>
-    </w:p>
-    <w:p>
-      <w:r>
+      <w:r>
+        <w:rPr>
+          <w:noProof/>
+        </w:rPr>
         <w:drawing>
           <wp:inline distT="0" distB="0" distL="0" distR="0" wp14:anchorId="11077483" wp14:editId="660D73AB">
             <wp:extent cx="2400508" cy="4854361"/>
             <wp:effectExtent l="0" t="0" r="0" b="3810"/>
             <wp:docPr id="3" name="Picture 3"/>
-            <wp:cNvGraphicFramePr>
-              <a:graphicFrameLocks xmlns:a="http://schemas.openxmlformats.org/drawingml/2006/main" noChangeAspect="1"/>
-            </wp:cNvGraphicFramePr>
-            <a:graphic xmlns:a="http://schemas.openxmlformats.org/drawingml/2006/main">
-              <a:graphicData uri="http://schemas.openxmlformats.org/drawingml/2006/picture">
-                <pic:pic xmlns:pic="http://schemas.openxmlformats.org/drawingml/2006/picture">
-                  <pic:nvPicPr>
-                    <pic:cNvPr id="1" name=""/>
-                    <pic:cNvPicPr/>
-                  </pic:nvPicPr>
-                  <pic:blipFill>
-                    <a:blip r:embed="rId4"/>
-                    <a:stretch>
-                      <a:fillRect/>
-                    </a:stretch>
-                  </pic:blipFill>
-                  <pic:spPr>
-                    <a:xfrm>
-                      <a:off x="0" y="0"/>
-                      <a:ext cx="2400508" cy="4854361"/>
-                    </a:xfrm>
-                    <a:prstGeom prst="rect">
-                      <a:avLst/>
-                    </a:prstGeom>
-                  </pic:spPr>
-                </pic:pic>
-              </a:graphicData>
-            </a:graphic>
-          </wp:inline>
-        </w:drawing>
-      </w:r>
-    </w:p>
-    <w:p>
-      <w:pPr>
-        <w:pStyle w:val="NormalWeb"/>
-        <w:spacing w:before="160" w:beforeAutospacing="0" w:after="60" w:afterAutospacing="0"/>
-      </w:pPr>
-      <w:proofErr w:type="spellStart"/>
-      <w:r>
-        <w:rPr>
-          <w:b/>
-          <w:bCs/>
-          <w:color w:val="3F51B5"/>
-          <w:sz w:val="21"/>
-          <w:szCs w:val="21"/>
-        </w:rPr>
-        <w:t>Bài</w:t>
-      </w:r>
-      <w:proofErr w:type="spellEnd"/>
-      <w:r>
-        <w:rPr>
-          <w:b/>
-          <w:bCs/>
-          <w:color w:val="3F51B5"/>
-          <w:sz w:val="21"/>
-          <w:szCs w:val="21"/>
-        </w:rPr>
-        <w:t xml:space="preserve"> </w:t>
-      </w:r>
-      <w:proofErr w:type="spellStart"/>
-      <w:r>
-        <w:rPr>
-          <w:b/>
-          <w:bCs/>
-          <w:color w:val="3F51B5"/>
-          <w:sz w:val="21"/>
-          <w:szCs w:val="21"/>
-        </w:rPr>
-        <w:t>tập</w:t>
-      </w:r>
-      <w:proofErr w:type="spellEnd"/>
-      <w:r>
-        <w:rPr>
-          <w:b/>
-          <w:bCs/>
-          <w:color w:val="3F51B5"/>
-          <w:sz w:val="21"/>
-          <w:szCs w:val="21"/>
-        </w:rPr>
-        <w:t xml:space="preserve"> 2: </w:t>
-      </w:r>
-      <w:proofErr w:type="spellStart"/>
-      <w:r>
-        <w:rPr>
-          <w:b/>
-          <w:bCs/>
-          <w:color w:val="000000"/>
-          <w:sz w:val="21"/>
-          <w:szCs w:val="21"/>
-        </w:rPr>
-        <w:t>Màn</w:t>
-      </w:r>
-      <w:proofErr w:type="spellEnd"/>
-      <w:r>
-        <w:rPr>
-          <w:b/>
-          <w:bCs/>
-          <w:color w:val="000000"/>
-          <w:sz w:val="21"/>
-          <w:szCs w:val="21"/>
-        </w:rPr>
-        <w:t xml:space="preserve"> </w:t>
-      </w:r>
-      <w:proofErr w:type="spellStart"/>
-      <w:r>
-        <w:rPr>
-          <w:b/>
-          <w:bCs/>
-          <w:color w:val="000000"/>
-          <w:sz w:val="21"/>
-          <w:szCs w:val="21"/>
-        </w:rPr>
-        <w:t>hình</w:t>
-      </w:r>
-      <w:proofErr w:type="spellEnd"/>
-      <w:r>
-        <w:rPr>
-          <w:b/>
-          <w:bCs/>
-          <w:color w:val="000000"/>
-          <w:sz w:val="21"/>
-          <w:szCs w:val="21"/>
-        </w:rPr>
-        <w:t xml:space="preserve"> Chi </w:t>
-      </w:r>
-      <w:proofErr w:type="spellStart"/>
-      <w:r>
-        <w:rPr>
-          <w:b/>
-          <w:bCs/>
-          <w:color w:val="000000"/>
-          <w:sz w:val="21"/>
-          <w:szCs w:val="21"/>
-        </w:rPr>
-        <w:t>tiết</w:t>
-      </w:r>
-      <w:proofErr w:type="spellEnd"/>
-      <w:r>
-        <w:rPr>
-          <w:b/>
-          <w:bCs/>
-          <w:color w:val="000000"/>
-          <w:sz w:val="21"/>
-          <w:szCs w:val="21"/>
-        </w:rPr>
-        <w:t xml:space="preserve"> </w:t>
-      </w:r>
-      <w:proofErr w:type="spellStart"/>
-      <w:r>
-        <w:rPr>
-          <w:b/>
-          <w:bCs/>
-          <w:color w:val="000000"/>
-          <w:sz w:val="21"/>
-          <w:szCs w:val="21"/>
-        </w:rPr>
-        <w:t>sách</w:t>
-      </w:r>
-      <w:proofErr w:type="spellEnd"/>
-      <w:r>
-        <w:rPr>
-          <w:b/>
-          <w:bCs/>
-          <w:color w:val="000000"/>
-          <w:sz w:val="21"/>
-          <w:szCs w:val="21"/>
-        </w:rPr>
-        <w:t xml:space="preserve"> (Book Detail)</w:t>
-      </w:r>
-      <w:r>
-        <w:rPr>
-          <w:i/>
-          <w:iCs/>
-          <w:color w:val="555555"/>
-          <w:sz w:val="19"/>
-          <w:szCs w:val="19"/>
-        </w:rPr>
-        <w:t> </w:t>
-      </w:r>
-    </w:p>
-    <w:p>
-      <w:pPr>
-        <w:pStyle w:val="NormalWeb"/>
-        <w:spacing w:before="0" w:beforeAutospacing="0" w:after="120" w:afterAutospacing="0"/>
-      </w:pPr>
-      <w:proofErr w:type="spellStart"/>
-      <w:r>
-        <w:rPr>
-          <w:color w:val="222222"/>
-          <w:sz w:val="21"/>
-          <w:szCs w:val="21"/>
-        </w:rPr>
-        <w:t>Dựng</w:t>
-      </w:r>
-      <w:proofErr w:type="spellEnd"/>
-      <w:r>
-        <w:rPr>
-          <w:color w:val="222222"/>
-          <w:sz w:val="21"/>
-          <w:szCs w:val="21"/>
-        </w:rPr>
-        <w:t xml:space="preserve"> </w:t>
-      </w:r>
-      <w:proofErr w:type="spellStart"/>
-      <w:r>
-        <w:rPr>
-          <w:color w:val="222222"/>
-          <w:sz w:val="21"/>
-          <w:szCs w:val="21"/>
-        </w:rPr>
-        <w:t>màn</w:t>
-      </w:r>
-      <w:proofErr w:type="spellEnd"/>
-      <w:r>
-        <w:rPr>
-          <w:color w:val="222222"/>
-          <w:sz w:val="21"/>
-          <w:szCs w:val="21"/>
-        </w:rPr>
-        <w:t xml:space="preserve"> </w:t>
-      </w:r>
-      <w:proofErr w:type="spellStart"/>
-      <w:r>
-        <w:rPr>
-          <w:color w:val="222222"/>
-          <w:sz w:val="21"/>
-          <w:szCs w:val="21"/>
-        </w:rPr>
-        <w:t>hình</w:t>
-      </w:r>
-      <w:proofErr w:type="spellEnd"/>
-      <w:r>
-        <w:rPr>
-          <w:color w:val="222222"/>
-          <w:sz w:val="21"/>
-          <w:szCs w:val="21"/>
-        </w:rPr>
-        <w:t xml:space="preserve"> chi </w:t>
-      </w:r>
-      <w:proofErr w:type="spellStart"/>
-      <w:r>
-        <w:rPr>
-          <w:color w:val="222222"/>
-          <w:sz w:val="21"/>
-          <w:szCs w:val="21"/>
-        </w:rPr>
-        <w:t>tiết</w:t>
-      </w:r>
-      <w:proofErr w:type="spellEnd"/>
-      <w:r>
-        <w:rPr>
-          <w:color w:val="222222"/>
-          <w:sz w:val="21"/>
-          <w:szCs w:val="21"/>
-        </w:rPr>
-        <w:t xml:space="preserve"> 1 </w:t>
-      </w:r>
-      <w:proofErr w:type="spellStart"/>
-      <w:r>
-        <w:rPr>
-          <w:color w:val="222222"/>
-          <w:sz w:val="21"/>
-          <w:szCs w:val="21"/>
-        </w:rPr>
-        <w:t>cuốn</w:t>
-      </w:r>
-      <w:proofErr w:type="spellEnd"/>
-      <w:r>
-        <w:rPr>
-          <w:color w:val="222222"/>
-          <w:sz w:val="21"/>
-          <w:szCs w:val="21"/>
-        </w:rPr>
-        <w:t xml:space="preserve"> </w:t>
-      </w:r>
-      <w:proofErr w:type="spellStart"/>
-      <w:r>
-        <w:rPr>
-          <w:color w:val="222222"/>
-          <w:sz w:val="21"/>
-          <w:szCs w:val="21"/>
-        </w:rPr>
-        <w:t>sách</w:t>
-      </w:r>
-      <w:proofErr w:type="spellEnd"/>
-      <w:r>
-        <w:rPr>
-          <w:color w:val="222222"/>
-          <w:sz w:val="21"/>
-          <w:szCs w:val="21"/>
-        </w:rPr>
-        <w:t xml:space="preserve">: </w:t>
-      </w:r>
-      <w:proofErr w:type="spellStart"/>
-      <w:r>
-        <w:rPr>
-          <w:color w:val="222222"/>
-          <w:sz w:val="21"/>
-          <w:szCs w:val="21"/>
-        </w:rPr>
-        <w:t>ảnh</w:t>
-      </w:r>
-      <w:proofErr w:type="spellEnd"/>
-      <w:r>
-        <w:rPr>
-          <w:color w:val="222222"/>
-          <w:sz w:val="21"/>
-          <w:szCs w:val="21"/>
-        </w:rPr>
-        <w:t xml:space="preserve"> </w:t>
-      </w:r>
-      <w:proofErr w:type="spellStart"/>
-      <w:r>
-        <w:rPr>
-          <w:color w:val="222222"/>
-          <w:sz w:val="21"/>
-          <w:szCs w:val="21"/>
-        </w:rPr>
-        <w:t>bìa</w:t>
-      </w:r>
-      <w:proofErr w:type="spellEnd"/>
-      <w:r>
-        <w:rPr>
-          <w:color w:val="222222"/>
-          <w:sz w:val="21"/>
-          <w:szCs w:val="21"/>
-        </w:rPr>
-        <w:t xml:space="preserve"> </w:t>
-      </w:r>
-      <w:proofErr w:type="spellStart"/>
-      <w:r>
-        <w:rPr>
-          <w:color w:val="222222"/>
-          <w:sz w:val="21"/>
-          <w:szCs w:val="21"/>
-        </w:rPr>
-        <w:t>lớn</w:t>
-      </w:r>
-      <w:proofErr w:type="spellEnd"/>
-      <w:r>
-        <w:rPr>
-          <w:color w:val="222222"/>
-          <w:sz w:val="21"/>
-          <w:szCs w:val="21"/>
-        </w:rPr>
-        <w:t xml:space="preserve"> </w:t>
-      </w:r>
-      <w:proofErr w:type="spellStart"/>
-      <w:r>
-        <w:rPr>
-          <w:color w:val="222222"/>
-          <w:sz w:val="21"/>
-          <w:szCs w:val="21"/>
-        </w:rPr>
-        <w:t>phía</w:t>
-      </w:r>
-      <w:proofErr w:type="spellEnd"/>
-      <w:r>
-        <w:rPr>
-          <w:color w:val="222222"/>
-          <w:sz w:val="21"/>
-          <w:szCs w:val="21"/>
-        </w:rPr>
-        <w:t xml:space="preserve"> </w:t>
-      </w:r>
-      <w:proofErr w:type="spellStart"/>
-      <w:r>
-        <w:rPr>
-          <w:color w:val="222222"/>
-          <w:sz w:val="21"/>
-          <w:szCs w:val="21"/>
-        </w:rPr>
-        <w:t>trên</w:t>
-      </w:r>
-      <w:proofErr w:type="spellEnd"/>
-      <w:r>
-        <w:rPr>
-          <w:color w:val="222222"/>
-          <w:sz w:val="21"/>
-          <w:szCs w:val="21"/>
-        </w:rPr>
-        <w:t xml:space="preserve"> (</w:t>
-      </w:r>
-      <w:proofErr w:type="spellStart"/>
-      <w:r>
-        <w:rPr>
-          <w:color w:val="222222"/>
-          <w:sz w:val="21"/>
-          <w:szCs w:val="21"/>
-        </w:rPr>
-        <w:t>căn</w:t>
-      </w:r>
-      <w:proofErr w:type="spellEnd"/>
-      <w:r>
-        <w:rPr>
-          <w:color w:val="222222"/>
-          <w:sz w:val="21"/>
-          <w:szCs w:val="21"/>
-        </w:rPr>
-        <w:t xml:space="preserve"> </w:t>
-      </w:r>
-      <w:proofErr w:type="spellStart"/>
-      <w:r>
-        <w:rPr>
-          <w:color w:val="222222"/>
-          <w:sz w:val="21"/>
-          <w:szCs w:val="21"/>
-        </w:rPr>
-        <w:t>giữa</w:t>
-      </w:r>
-      <w:proofErr w:type="spellEnd"/>
-      <w:r>
-        <w:rPr>
-          <w:color w:val="222222"/>
-          <w:sz w:val="21"/>
-          <w:szCs w:val="21"/>
-        </w:rPr>
-        <w:t xml:space="preserve">), </w:t>
-      </w:r>
-      <w:proofErr w:type="spellStart"/>
-      <w:r>
-        <w:rPr>
-          <w:color w:val="222222"/>
-          <w:sz w:val="21"/>
-          <w:szCs w:val="21"/>
-        </w:rPr>
-        <w:t>tên</w:t>
-      </w:r>
-      <w:proofErr w:type="spellEnd"/>
-      <w:r>
-        <w:rPr>
-          <w:color w:val="222222"/>
-          <w:sz w:val="21"/>
-          <w:szCs w:val="21"/>
-        </w:rPr>
-        <w:t xml:space="preserve"> </w:t>
-      </w:r>
-      <w:proofErr w:type="spellStart"/>
-      <w:r>
-        <w:rPr>
-          <w:color w:val="222222"/>
-          <w:sz w:val="21"/>
-          <w:szCs w:val="21"/>
-        </w:rPr>
-        <w:t>sách</w:t>
-      </w:r>
-      <w:proofErr w:type="spellEnd"/>
-      <w:r>
-        <w:rPr>
-          <w:color w:val="222222"/>
-          <w:sz w:val="21"/>
-          <w:szCs w:val="21"/>
-        </w:rPr>
-        <w:t xml:space="preserve"> + </w:t>
-      </w:r>
-      <w:proofErr w:type="spellStart"/>
-      <w:r>
-        <w:rPr>
-          <w:color w:val="222222"/>
-          <w:sz w:val="21"/>
-          <w:szCs w:val="21"/>
-        </w:rPr>
-        <w:t>tác</w:t>
-      </w:r>
-      <w:proofErr w:type="spellEnd"/>
-      <w:r>
-        <w:rPr>
-          <w:color w:val="222222"/>
-          <w:sz w:val="21"/>
-          <w:szCs w:val="21"/>
-        </w:rPr>
-        <w:t xml:space="preserve"> </w:t>
-      </w:r>
-      <w:proofErr w:type="spellStart"/>
-      <w:r>
-        <w:rPr>
-          <w:color w:val="222222"/>
-          <w:sz w:val="21"/>
-          <w:szCs w:val="21"/>
-        </w:rPr>
-        <w:t>giả</w:t>
-      </w:r>
-      <w:proofErr w:type="spellEnd"/>
-      <w:r>
-        <w:rPr>
-          <w:color w:val="222222"/>
-          <w:sz w:val="21"/>
-          <w:szCs w:val="21"/>
-        </w:rPr>
-        <w:t xml:space="preserve"> + </w:t>
-      </w:r>
-      <w:proofErr w:type="spellStart"/>
-      <w:r>
-        <w:rPr>
-          <w:color w:val="222222"/>
-          <w:sz w:val="21"/>
-          <w:szCs w:val="21"/>
-        </w:rPr>
-        <w:t>giá</w:t>
-      </w:r>
-      <w:proofErr w:type="spellEnd"/>
-      <w:r>
-        <w:rPr>
-          <w:color w:val="222222"/>
-          <w:sz w:val="21"/>
-          <w:szCs w:val="21"/>
-        </w:rPr>
-        <w:t xml:space="preserve"> + </w:t>
-      </w:r>
-      <w:proofErr w:type="spellStart"/>
-      <w:r>
-        <w:rPr>
-          <w:color w:val="222222"/>
-          <w:sz w:val="21"/>
-          <w:szCs w:val="21"/>
-        </w:rPr>
-        <w:t>mô</w:t>
-      </w:r>
-      <w:proofErr w:type="spellEnd"/>
-      <w:r>
-        <w:rPr>
-          <w:color w:val="222222"/>
-          <w:sz w:val="21"/>
-          <w:szCs w:val="21"/>
-        </w:rPr>
-        <w:t xml:space="preserve"> </w:t>
-      </w:r>
-      <w:proofErr w:type="spellStart"/>
-      <w:r>
-        <w:rPr>
-          <w:color w:val="222222"/>
-          <w:sz w:val="21"/>
-          <w:szCs w:val="21"/>
-        </w:rPr>
-        <w:t>tả</w:t>
-      </w:r>
-      <w:proofErr w:type="spellEnd"/>
-      <w:r>
-        <w:rPr>
-          <w:color w:val="222222"/>
-          <w:sz w:val="21"/>
-          <w:szCs w:val="21"/>
-        </w:rPr>
-        <w:t xml:space="preserve"> </w:t>
-      </w:r>
-      <w:proofErr w:type="spellStart"/>
-      <w:r>
-        <w:rPr>
-          <w:color w:val="222222"/>
-          <w:sz w:val="21"/>
-          <w:szCs w:val="21"/>
-        </w:rPr>
-        <w:t>dài</w:t>
-      </w:r>
-      <w:proofErr w:type="spellEnd"/>
-      <w:r>
-        <w:rPr>
-          <w:color w:val="222222"/>
-          <w:sz w:val="21"/>
-          <w:szCs w:val="21"/>
-        </w:rPr>
-        <w:t xml:space="preserve"> </w:t>
-      </w:r>
-      <w:proofErr w:type="spellStart"/>
-      <w:r>
-        <w:rPr>
-          <w:color w:val="222222"/>
-          <w:sz w:val="21"/>
-          <w:szCs w:val="21"/>
-        </w:rPr>
-        <w:t>phía</w:t>
-      </w:r>
-      <w:proofErr w:type="spellEnd"/>
-      <w:r>
-        <w:rPr>
-          <w:color w:val="222222"/>
-          <w:sz w:val="21"/>
-          <w:szCs w:val="21"/>
-        </w:rPr>
-        <w:t xml:space="preserve"> </w:t>
-      </w:r>
-      <w:proofErr w:type="spellStart"/>
-      <w:r>
-        <w:rPr>
-          <w:color w:val="222222"/>
-          <w:sz w:val="21"/>
-          <w:szCs w:val="21"/>
-        </w:rPr>
-        <w:t>dưới</w:t>
-      </w:r>
-      <w:proofErr w:type="spellEnd"/>
-      <w:r>
-        <w:rPr>
-          <w:color w:val="222222"/>
-          <w:sz w:val="21"/>
-          <w:szCs w:val="21"/>
-        </w:rPr>
-        <w:t xml:space="preserve"> (</w:t>
-      </w:r>
-      <w:proofErr w:type="spellStart"/>
-      <w:r>
-        <w:rPr>
-          <w:color w:val="222222"/>
-          <w:sz w:val="21"/>
-          <w:szCs w:val="21"/>
-        </w:rPr>
-        <w:t>cuộn</w:t>
-      </w:r>
-      <w:proofErr w:type="spellEnd"/>
-      <w:r>
-        <w:rPr>
-          <w:color w:val="222222"/>
-          <w:sz w:val="21"/>
-          <w:szCs w:val="21"/>
-        </w:rPr>
-        <w:t xml:space="preserve"> </w:t>
-      </w:r>
-      <w:proofErr w:type="spellStart"/>
-      <w:r>
-        <w:rPr>
-          <w:color w:val="222222"/>
-          <w:sz w:val="21"/>
-          <w:szCs w:val="21"/>
-        </w:rPr>
-        <w:t>được</w:t>
-      </w:r>
-      <w:proofErr w:type="spellEnd"/>
-      <w:r>
-        <w:rPr>
-          <w:color w:val="222222"/>
-          <w:sz w:val="21"/>
-          <w:szCs w:val="21"/>
-        </w:rPr>
-        <w:t xml:space="preserve">), </w:t>
-      </w:r>
-      <w:proofErr w:type="spellStart"/>
-      <w:r>
-        <w:rPr>
-          <w:color w:val="222222"/>
-          <w:sz w:val="21"/>
-          <w:szCs w:val="21"/>
-        </w:rPr>
-        <w:t>thanh</w:t>
-      </w:r>
-      <w:proofErr w:type="spellEnd"/>
-      <w:r>
-        <w:rPr>
-          <w:color w:val="222222"/>
-          <w:sz w:val="21"/>
-          <w:szCs w:val="21"/>
-        </w:rPr>
-        <w:t xml:space="preserve"> '</w:t>
-      </w:r>
-      <w:proofErr w:type="spellStart"/>
-      <w:r>
-        <w:rPr>
-          <w:color w:val="222222"/>
-          <w:sz w:val="21"/>
-          <w:szCs w:val="21"/>
-        </w:rPr>
-        <w:t>Thêm</w:t>
-      </w:r>
-      <w:proofErr w:type="spellEnd"/>
-      <w:r>
-        <w:rPr>
-          <w:color w:val="222222"/>
-          <w:sz w:val="21"/>
-          <w:szCs w:val="21"/>
-        </w:rPr>
-        <w:t xml:space="preserve"> </w:t>
-      </w:r>
-      <w:proofErr w:type="spellStart"/>
-      <w:r>
-        <w:rPr>
-          <w:color w:val="222222"/>
-          <w:sz w:val="21"/>
-          <w:szCs w:val="21"/>
-        </w:rPr>
-        <w:t>vào</w:t>
-      </w:r>
-      <w:proofErr w:type="spellEnd"/>
-      <w:r>
-        <w:rPr>
-          <w:color w:val="222222"/>
-          <w:sz w:val="21"/>
-          <w:szCs w:val="21"/>
-        </w:rPr>
-        <w:t xml:space="preserve"> </w:t>
-      </w:r>
-      <w:proofErr w:type="spellStart"/>
-      <w:r>
-        <w:rPr>
-          <w:color w:val="222222"/>
-          <w:sz w:val="21"/>
-          <w:szCs w:val="21"/>
-        </w:rPr>
-        <w:t>giỏ</w:t>
-      </w:r>
-      <w:proofErr w:type="spellEnd"/>
-      <w:r>
-        <w:rPr>
-          <w:color w:val="222222"/>
-          <w:sz w:val="21"/>
-          <w:szCs w:val="21"/>
-        </w:rPr>
-        <w:t xml:space="preserve">' </w:t>
-      </w:r>
-      <w:proofErr w:type="spellStart"/>
-      <w:r>
-        <w:rPr>
-          <w:color w:val="222222"/>
-          <w:sz w:val="21"/>
-          <w:szCs w:val="21"/>
-        </w:rPr>
-        <w:t>cố</w:t>
-      </w:r>
-      <w:proofErr w:type="spellEnd"/>
-      <w:r>
-        <w:rPr>
-          <w:color w:val="222222"/>
-          <w:sz w:val="21"/>
-          <w:szCs w:val="21"/>
-        </w:rPr>
-        <w:t xml:space="preserve"> </w:t>
-      </w:r>
-      <w:proofErr w:type="spellStart"/>
-      <w:r>
-        <w:rPr>
-          <w:color w:val="222222"/>
-          <w:sz w:val="21"/>
-          <w:szCs w:val="21"/>
-        </w:rPr>
-        <w:t>định</w:t>
-      </w:r>
-      <w:proofErr w:type="spellEnd"/>
-      <w:r>
-        <w:rPr>
-          <w:color w:val="222222"/>
-          <w:sz w:val="21"/>
-          <w:szCs w:val="21"/>
-        </w:rPr>
-        <w:t xml:space="preserve"> </w:t>
-      </w:r>
-      <w:proofErr w:type="spellStart"/>
-      <w:r>
-        <w:rPr>
-          <w:color w:val="222222"/>
-          <w:sz w:val="21"/>
-          <w:szCs w:val="21"/>
-        </w:rPr>
-        <w:t>dưới</w:t>
-      </w:r>
-      <w:proofErr w:type="spellEnd"/>
-      <w:r>
-        <w:rPr>
-          <w:color w:val="222222"/>
-          <w:sz w:val="21"/>
-          <w:szCs w:val="21"/>
-        </w:rPr>
-        <w:t xml:space="preserve"> </w:t>
-      </w:r>
-      <w:proofErr w:type="spellStart"/>
-      <w:r>
-        <w:rPr>
-          <w:color w:val="222222"/>
-          <w:sz w:val="21"/>
-          <w:szCs w:val="21"/>
-        </w:rPr>
-        <w:t>cùng</w:t>
-      </w:r>
-      <w:proofErr w:type="spellEnd"/>
-      <w:r>
-        <w:rPr>
-          <w:color w:val="222222"/>
-          <w:sz w:val="21"/>
-          <w:szCs w:val="21"/>
-        </w:rPr>
-        <w:t xml:space="preserve"> </w:t>
-      </w:r>
-      <w:proofErr w:type="spellStart"/>
-      <w:r>
-        <w:rPr>
-          <w:color w:val="222222"/>
-          <w:sz w:val="21"/>
-          <w:szCs w:val="21"/>
-        </w:rPr>
-        <w:t>màn</w:t>
-      </w:r>
-      <w:proofErr w:type="spellEnd"/>
-      <w:r>
-        <w:rPr>
-          <w:color w:val="222222"/>
-          <w:sz w:val="21"/>
-          <w:szCs w:val="21"/>
-        </w:rPr>
-        <w:t xml:space="preserve"> </w:t>
-      </w:r>
-      <w:proofErr w:type="spellStart"/>
-      <w:r>
-        <w:rPr>
-          <w:color w:val="222222"/>
-          <w:sz w:val="21"/>
-          <w:szCs w:val="21"/>
-        </w:rPr>
-        <w:t>hình</w:t>
-      </w:r>
-      <w:proofErr w:type="spellEnd"/>
-      <w:r>
-        <w:rPr>
-          <w:color w:val="222222"/>
-          <w:sz w:val="21"/>
-          <w:szCs w:val="21"/>
-        </w:rPr>
-        <w:t>.</w:t>
-      </w:r>
-    </w:p>
-    <w:p>
-      <w:r>
-        <w:lastRenderedPageBreak/>
-        <w:drawing>
-          <wp:inline distT="0" distB="0" distL="0" distR="0" wp14:anchorId="2AC235FF" wp14:editId="779E53A5">
-            <wp:extent cx="2461473" cy="5044877"/>
-            <wp:effectExtent l="0" t="0" r="0" b="3810"/>
-            <wp:docPr id="4" name="Picture 4"/>
             <wp:cNvGraphicFramePr>
               <a:graphicFrameLocks xmlns:a="http://schemas.openxmlformats.org/drawingml/2006/main" noChangeAspect="1"/>
             </wp:cNvGraphicFramePr>
@@ -1466,7 +664,7 @@
                   <pic:spPr>
                     <a:xfrm>
                       <a:off x="0" y="0"/>
-                      <a:ext cx="2461473" cy="5044877"/>
+                      <a:ext cx="2400508" cy="4854361"/>
                     </a:xfrm>
                     <a:prstGeom prst="rect">
                       <a:avLst/>
@@ -1479,154 +677,6 @@
         </w:drawing>
       </w:r>
     </w:p>
-    <w:p/>
-    <w:p>
-      <w:r>
-        <w:br w:type="page"/>
-      </w:r>
-    </w:p>
-    <w:p>
-      <w:pPr>
-        <w:rPr>
-          <w:b/>
-          <w:bCs/>
-          <w:sz w:val="26"/>
-          <w:szCs w:val="26"/>
-        </w:rPr>
-      </w:pPr>
-      <w:proofErr w:type="spellStart"/>
-      <w:r>
-        <w:rPr>
-          <w:b/>
-          <w:bCs/>
-          <w:sz w:val="26"/>
-          <w:szCs w:val="26"/>
-        </w:rPr>
-        <w:lastRenderedPageBreak/>
-        <w:t>Giờ</w:t>
-      </w:r>
-      <w:proofErr w:type="spellEnd"/>
-      <w:r>
-        <w:rPr>
-          <w:b/>
-          <w:bCs/>
-          <w:sz w:val="26"/>
-          <w:szCs w:val="26"/>
-        </w:rPr>
-        <w:t xml:space="preserve"> 5 — </w:t>
-      </w:r>
-      <w:proofErr w:type="spellStart"/>
-      <w:r>
-        <w:rPr>
-          <w:b/>
-          <w:bCs/>
-          <w:sz w:val="26"/>
-          <w:szCs w:val="26"/>
-        </w:rPr>
-        <w:t>Tổng</w:t>
-      </w:r>
-      <w:proofErr w:type="spellEnd"/>
-      <w:r>
-        <w:rPr>
-          <w:b/>
-          <w:bCs/>
-          <w:sz w:val="26"/>
-          <w:szCs w:val="26"/>
-        </w:rPr>
-        <w:t xml:space="preserve"> </w:t>
-      </w:r>
-      <w:proofErr w:type="spellStart"/>
-      <w:r>
-        <w:rPr>
-          <w:b/>
-          <w:bCs/>
-          <w:sz w:val="26"/>
-          <w:szCs w:val="26"/>
-        </w:rPr>
-        <w:t>hợp</w:t>
-      </w:r>
-      <w:proofErr w:type="spellEnd"/>
-      <w:r>
-        <w:rPr>
-          <w:b/>
-          <w:bCs/>
-          <w:sz w:val="26"/>
-          <w:szCs w:val="26"/>
-        </w:rPr>
-        <w:t xml:space="preserve">: Bottom Tab Layout &amp; </w:t>
-      </w:r>
-      <w:proofErr w:type="spellStart"/>
-      <w:r>
-        <w:rPr>
-          <w:b/>
-          <w:bCs/>
-          <w:sz w:val="26"/>
-          <w:szCs w:val="26"/>
-        </w:rPr>
-        <w:t>Hoàn</w:t>
-      </w:r>
-      <w:proofErr w:type="spellEnd"/>
-      <w:r>
-        <w:rPr>
-          <w:b/>
-          <w:bCs/>
-          <w:sz w:val="26"/>
-          <w:szCs w:val="26"/>
-        </w:rPr>
-        <w:t xml:space="preserve"> </w:t>
-      </w:r>
-      <w:proofErr w:type="spellStart"/>
-      <w:r>
-        <w:rPr>
-          <w:b/>
-          <w:bCs/>
-          <w:sz w:val="26"/>
-          <w:szCs w:val="26"/>
-        </w:rPr>
-        <w:t>thiện</w:t>
-      </w:r>
-      <w:proofErr w:type="spellEnd"/>
-      <w:r>
-        <w:rPr>
-          <w:b/>
-          <w:bCs/>
-          <w:sz w:val="26"/>
-          <w:szCs w:val="26"/>
-        </w:rPr>
-        <w:t xml:space="preserve"> </w:t>
-      </w:r>
-      <w:proofErr w:type="spellStart"/>
-      <w:r>
-        <w:rPr>
-          <w:b/>
-          <w:bCs/>
-          <w:sz w:val="26"/>
-          <w:szCs w:val="26"/>
-        </w:rPr>
-        <w:t>ứng</w:t>
-      </w:r>
-      <w:proofErr w:type="spellEnd"/>
-      <w:r>
-        <w:rPr>
-          <w:b/>
-          <w:bCs/>
-          <w:sz w:val="26"/>
-          <w:szCs w:val="26"/>
-        </w:rPr>
-        <w:t xml:space="preserve"> </w:t>
-      </w:r>
-      <w:proofErr w:type="spellStart"/>
-      <w:r>
-        <w:rPr>
-          <w:b/>
-          <w:bCs/>
-          <w:sz w:val="26"/>
-          <w:szCs w:val="26"/>
-        </w:rPr>
-        <w:t>dụng</w:t>
-      </w:r>
-      <w:proofErr w:type="spellEnd"/>
-    </w:p>
     <w:p>
       <w:pPr>
         <w:pStyle w:val="NormalWeb"/>
@@ -1674,8 +724,9 @@
           <w:sz w:val="21"/>
           <w:szCs w:val="21"/>
         </w:rPr>
-        <w:t xml:space="preserve"> 1: </w:t>
-      </w:r>
+        <w:t xml:space="preserve"> 2: </w:t>
+      </w:r>
+      <w:proofErr w:type="spellStart"/>
       <w:r>
         <w:rPr>
           <w:b/>
@@ -1684,9 +735,9 @@
           <w:sz w:val="21"/>
           <w:szCs w:val="21"/>
         </w:rPr>
-        <w:t xml:space="preserve">Thanh Tab Bar </w:t>
-      </w:r>
-      <w:proofErr w:type="spellStart"/>
+        <w:t>Màn</w:t>
+      </w:r>
+      <w:proofErr w:type="spellEnd"/>
       <w:r>
         <w:rPr>
           <w:b/>
@@ -1695,9 +746,9 @@
           <w:sz w:val="21"/>
           <w:szCs w:val="21"/>
         </w:rPr>
-        <w:t>dưới</w:t>
-      </w:r>
-      <w:proofErr w:type="spellEnd"/>
+        <w:t xml:space="preserve"> </w:t>
+      </w:r>
+      <w:proofErr w:type="spellStart"/>
       <w:r>
         <w:rPr>
           <w:b/>
@@ -1706,9 +757,9 @@
           <w:sz w:val="21"/>
           <w:szCs w:val="21"/>
         </w:rPr>
-        <w:t xml:space="preserve"> </w:t>
-      </w:r>
-      <w:proofErr w:type="spellStart"/>
+        <w:t>hình</w:t>
+      </w:r>
+      <w:proofErr w:type="spellEnd"/>
       <w:r>
         <w:rPr>
           <w:b/>
@@ -1717,9 +768,9 @@
           <w:sz w:val="21"/>
           <w:szCs w:val="21"/>
         </w:rPr>
-        <w:t>cùng</w:t>
-      </w:r>
-      <w:proofErr w:type="spellEnd"/>
+        <w:t xml:space="preserve"> Chi </w:t>
+      </w:r>
+      <w:proofErr w:type="spellStart"/>
       <w:r>
         <w:rPr>
           <w:b/>
@@ -1728,9 +779,9 @@
           <w:sz w:val="21"/>
           <w:szCs w:val="21"/>
         </w:rPr>
-        <w:t xml:space="preserve"> (</w:t>
-      </w:r>
-      <w:proofErr w:type="spellStart"/>
+        <w:t>tiết</w:t>
+      </w:r>
+      <w:proofErr w:type="spellEnd"/>
       <w:r>
         <w:rPr>
           <w:b/>
@@ -1739,9 +790,9 @@
           <w:sz w:val="21"/>
           <w:szCs w:val="21"/>
         </w:rPr>
-        <w:t>giao</w:t>
-      </w:r>
-      <w:proofErr w:type="spellEnd"/>
+        <w:t xml:space="preserve"> </w:t>
+      </w:r>
+      <w:proofErr w:type="spellStart"/>
       <w:r>
         <w:rPr>
           <w:b/>
@@ -1750,9 +801,9 @@
           <w:sz w:val="21"/>
           <w:szCs w:val="21"/>
         </w:rPr>
-        <w:t xml:space="preserve"> </w:t>
-      </w:r>
-      <w:proofErr w:type="spellStart"/>
+        <w:t>sách</w:t>
+      </w:r>
+      <w:proofErr w:type="spellEnd"/>
       <w:r>
         <w:rPr>
           <w:b/>
@@ -1761,40 +812,17 @@
           <w:sz w:val="21"/>
           <w:szCs w:val="21"/>
         </w:rPr>
-        <w:t>diện</w:t>
-      </w:r>
-      <w:proofErr w:type="spellEnd"/>
-      <w:r>
-        <w:rPr>
-          <w:b/>
-          <w:bCs/>
-          <w:color w:val="000000"/>
-          <w:sz w:val="21"/>
-          <w:szCs w:val="21"/>
-        </w:rPr>
-        <w:t xml:space="preserve"> </w:t>
-      </w:r>
-      <w:proofErr w:type="spellStart"/>
-      <w:r>
-        <w:rPr>
-          <w:b/>
-          <w:bCs/>
-          <w:color w:val="000000"/>
-          <w:sz w:val="21"/>
-          <w:szCs w:val="21"/>
-        </w:rPr>
-        <w:t>tĩnh</w:t>
-      </w:r>
-      <w:proofErr w:type="spellEnd"/>
-      <w:r>
-        <w:rPr>
-          <w:b/>
-          <w:bCs/>
-          <w:color w:val="000000"/>
-          <w:sz w:val="21"/>
-          <w:szCs w:val="21"/>
-        </w:rPr>
-        <w:t>)</w:t>
+        <w:t xml:space="preserve"> (Book Detail)</w:t>
+      </w:r>
+      <w:r>
+        <w:rPr>
+          <w:i/>
+          <w:iCs/>
+          <w:color w:val="555555"/>
+          <w:sz w:val="19"/>
+          <w:szCs w:val="19"/>
+        </w:rPr>
+        <w:t> </w:t>
       </w:r>
     </w:p>
     <w:p>
@@ -1827,6 +855,438 @@
           <w:sz w:val="21"/>
           <w:szCs w:val="21"/>
         </w:rPr>
+        <w:t>màn</w:t>
+      </w:r>
+      <w:proofErr w:type="spellEnd"/>
+      <w:r>
+        <w:rPr>
+          <w:color w:val="222222"/>
+          <w:sz w:val="21"/>
+          <w:szCs w:val="21"/>
+        </w:rPr>
+        <w:t xml:space="preserve"> </w:t>
+      </w:r>
+      <w:proofErr w:type="spellStart"/>
+      <w:r>
+        <w:rPr>
+          <w:color w:val="222222"/>
+          <w:sz w:val="21"/>
+          <w:szCs w:val="21"/>
+        </w:rPr>
+        <w:t>hình</w:t>
+      </w:r>
+      <w:proofErr w:type="spellEnd"/>
+      <w:r>
+        <w:rPr>
+          <w:color w:val="222222"/>
+          <w:sz w:val="21"/>
+          <w:szCs w:val="21"/>
+        </w:rPr>
+        <w:t xml:space="preserve"> chi </w:t>
+      </w:r>
+      <w:proofErr w:type="spellStart"/>
+      <w:r>
+        <w:rPr>
+          <w:color w:val="222222"/>
+          <w:sz w:val="21"/>
+          <w:szCs w:val="21"/>
+        </w:rPr>
+        <w:t>tiết</w:t>
+      </w:r>
+      <w:proofErr w:type="spellEnd"/>
+      <w:r>
+        <w:rPr>
+          <w:color w:val="222222"/>
+          <w:sz w:val="21"/>
+          <w:szCs w:val="21"/>
+        </w:rPr>
+        <w:t xml:space="preserve"> 1 </w:t>
+      </w:r>
+      <w:proofErr w:type="spellStart"/>
+      <w:r>
+        <w:rPr>
+          <w:color w:val="222222"/>
+          <w:sz w:val="21"/>
+          <w:szCs w:val="21"/>
+        </w:rPr>
+        <w:t>cuốn</w:t>
+      </w:r>
+      <w:proofErr w:type="spellEnd"/>
+      <w:r>
+        <w:rPr>
+          <w:color w:val="222222"/>
+          <w:sz w:val="21"/>
+          <w:szCs w:val="21"/>
+        </w:rPr>
+        <w:t xml:space="preserve"> </w:t>
+      </w:r>
+      <w:proofErr w:type="spellStart"/>
+      <w:r>
+        <w:rPr>
+          <w:color w:val="222222"/>
+          <w:sz w:val="21"/>
+          <w:szCs w:val="21"/>
+        </w:rPr>
+        <w:t>sách</w:t>
+      </w:r>
+      <w:proofErr w:type="spellEnd"/>
+      <w:r>
+        <w:rPr>
+          <w:color w:val="222222"/>
+          <w:sz w:val="21"/>
+          <w:szCs w:val="21"/>
+        </w:rPr>
+        <w:t xml:space="preserve">: </w:t>
+      </w:r>
+      <w:proofErr w:type="spellStart"/>
+      <w:r>
+        <w:rPr>
+          <w:color w:val="222222"/>
+          <w:sz w:val="21"/>
+          <w:szCs w:val="21"/>
+        </w:rPr>
+        <w:t>ảnh</w:t>
+      </w:r>
+      <w:proofErr w:type="spellEnd"/>
+      <w:r>
+        <w:rPr>
+          <w:color w:val="222222"/>
+          <w:sz w:val="21"/>
+          <w:szCs w:val="21"/>
+        </w:rPr>
+        <w:t xml:space="preserve"> </w:t>
+      </w:r>
+      <w:proofErr w:type="spellStart"/>
+      <w:r>
+        <w:rPr>
+          <w:color w:val="222222"/>
+          <w:sz w:val="21"/>
+          <w:szCs w:val="21"/>
+        </w:rPr>
+        <w:t>bìa</w:t>
+      </w:r>
+      <w:proofErr w:type="spellEnd"/>
+      <w:r>
+        <w:rPr>
+          <w:color w:val="222222"/>
+          <w:sz w:val="21"/>
+          <w:szCs w:val="21"/>
+        </w:rPr>
+        <w:t xml:space="preserve"> </w:t>
+      </w:r>
+      <w:proofErr w:type="spellStart"/>
+      <w:r>
+        <w:rPr>
+          <w:color w:val="222222"/>
+          <w:sz w:val="21"/>
+          <w:szCs w:val="21"/>
+        </w:rPr>
+        <w:t>lớn</w:t>
+      </w:r>
+      <w:proofErr w:type="spellEnd"/>
+      <w:r>
+        <w:rPr>
+          <w:color w:val="222222"/>
+          <w:sz w:val="21"/>
+          <w:szCs w:val="21"/>
+        </w:rPr>
+        <w:t xml:space="preserve"> </w:t>
+      </w:r>
+      <w:proofErr w:type="spellStart"/>
+      <w:r>
+        <w:rPr>
+          <w:color w:val="222222"/>
+          <w:sz w:val="21"/>
+          <w:szCs w:val="21"/>
+        </w:rPr>
+        <w:t>phía</w:t>
+      </w:r>
+      <w:proofErr w:type="spellEnd"/>
+      <w:r>
+        <w:rPr>
+          <w:color w:val="222222"/>
+          <w:sz w:val="21"/>
+          <w:szCs w:val="21"/>
+        </w:rPr>
+        <w:t xml:space="preserve"> </w:t>
+      </w:r>
+      <w:proofErr w:type="spellStart"/>
+      <w:r>
+        <w:rPr>
+          <w:color w:val="222222"/>
+          <w:sz w:val="21"/>
+          <w:szCs w:val="21"/>
+        </w:rPr>
+        <w:t>trên</w:t>
+      </w:r>
+      <w:proofErr w:type="spellEnd"/>
+      <w:r>
+        <w:rPr>
+          <w:color w:val="222222"/>
+          <w:sz w:val="21"/>
+          <w:szCs w:val="21"/>
+        </w:rPr>
+        <w:t xml:space="preserve"> (</w:t>
+      </w:r>
+      <w:proofErr w:type="spellStart"/>
+      <w:r>
+        <w:rPr>
+          <w:color w:val="222222"/>
+          <w:sz w:val="21"/>
+          <w:szCs w:val="21"/>
+        </w:rPr>
+        <w:t>căn</w:t>
+      </w:r>
+      <w:proofErr w:type="spellEnd"/>
+      <w:r>
+        <w:rPr>
+          <w:color w:val="222222"/>
+          <w:sz w:val="21"/>
+          <w:szCs w:val="21"/>
+        </w:rPr>
+        <w:t xml:space="preserve"> </w:t>
+      </w:r>
+      <w:proofErr w:type="spellStart"/>
+      <w:r>
+        <w:rPr>
+          <w:color w:val="222222"/>
+          <w:sz w:val="21"/>
+          <w:szCs w:val="21"/>
+        </w:rPr>
+        <w:t>giữa</w:t>
+      </w:r>
+      <w:proofErr w:type="spellEnd"/>
+      <w:r>
+        <w:rPr>
+          <w:color w:val="222222"/>
+          <w:sz w:val="21"/>
+          <w:szCs w:val="21"/>
+        </w:rPr>
+        <w:t xml:space="preserve">), </w:t>
+      </w:r>
+      <w:proofErr w:type="spellStart"/>
+      <w:r>
+        <w:rPr>
+          <w:color w:val="222222"/>
+          <w:sz w:val="21"/>
+          <w:szCs w:val="21"/>
+        </w:rPr>
+        <w:t>tên</w:t>
+      </w:r>
+      <w:proofErr w:type="spellEnd"/>
+      <w:r>
+        <w:rPr>
+          <w:color w:val="222222"/>
+          <w:sz w:val="21"/>
+          <w:szCs w:val="21"/>
+        </w:rPr>
+        <w:t xml:space="preserve"> </w:t>
+      </w:r>
+      <w:proofErr w:type="spellStart"/>
+      <w:r>
+        <w:rPr>
+          <w:color w:val="222222"/>
+          <w:sz w:val="21"/>
+          <w:szCs w:val="21"/>
+        </w:rPr>
+        <w:t>sách</w:t>
+      </w:r>
+      <w:proofErr w:type="spellEnd"/>
+      <w:r>
+        <w:rPr>
+          <w:color w:val="222222"/>
+          <w:sz w:val="21"/>
+          <w:szCs w:val="21"/>
+        </w:rPr>
+        <w:t xml:space="preserve"> + </w:t>
+      </w:r>
+      <w:proofErr w:type="spellStart"/>
+      <w:r>
+        <w:rPr>
+          <w:color w:val="222222"/>
+          <w:sz w:val="21"/>
+          <w:szCs w:val="21"/>
+        </w:rPr>
+        <w:t>tác</w:t>
+      </w:r>
+      <w:proofErr w:type="spellEnd"/>
+      <w:r>
+        <w:rPr>
+          <w:color w:val="222222"/>
+          <w:sz w:val="21"/>
+          <w:szCs w:val="21"/>
+        </w:rPr>
+        <w:t xml:space="preserve"> </w:t>
+      </w:r>
+      <w:proofErr w:type="spellStart"/>
+      <w:r>
+        <w:rPr>
+          <w:color w:val="222222"/>
+          <w:sz w:val="21"/>
+          <w:szCs w:val="21"/>
+        </w:rPr>
+        <w:t>giả</w:t>
+      </w:r>
+      <w:proofErr w:type="spellEnd"/>
+      <w:r>
+        <w:rPr>
+          <w:color w:val="222222"/>
+          <w:sz w:val="21"/>
+          <w:szCs w:val="21"/>
+        </w:rPr>
+        <w:t xml:space="preserve"> + </w:t>
+      </w:r>
+      <w:proofErr w:type="spellStart"/>
+      <w:r>
+        <w:rPr>
+          <w:color w:val="222222"/>
+          <w:sz w:val="21"/>
+          <w:szCs w:val="21"/>
+        </w:rPr>
+        <w:t>giá</w:t>
+      </w:r>
+      <w:proofErr w:type="spellEnd"/>
+      <w:r>
+        <w:rPr>
+          <w:color w:val="222222"/>
+          <w:sz w:val="21"/>
+          <w:szCs w:val="21"/>
+        </w:rPr>
+        <w:t xml:space="preserve"> + </w:t>
+      </w:r>
+      <w:proofErr w:type="spellStart"/>
+      <w:r>
+        <w:rPr>
+          <w:color w:val="222222"/>
+          <w:sz w:val="21"/>
+          <w:szCs w:val="21"/>
+        </w:rPr>
+        <w:t>mô</w:t>
+      </w:r>
+      <w:proofErr w:type="spellEnd"/>
+      <w:r>
+        <w:rPr>
+          <w:color w:val="222222"/>
+          <w:sz w:val="21"/>
+          <w:szCs w:val="21"/>
+        </w:rPr>
+        <w:t xml:space="preserve"> </w:t>
+      </w:r>
+      <w:proofErr w:type="spellStart"/>
+      <w:r>
+        <w:rPr>
+          <w:color w:val="222222"/>
+          <w:sz w:val="21"/>
+          <w:szCs w:val="21"/>
+        </w:rPr>
+        <w:t>tả</w:t>
+      </w:r>
+      <w:proofErr w:type="spellEnd"/>
+      <w:r>
+        <w:rPr>
+          <w:color w:val="222222"/>
+          <w:sz w:val="21"/>
+          <w:szCs w:val="21"/>
+        </w:rPr>
+        <w:t xml:space="preserve"> </w:t>
+      </w:r>
+      <w:proofErr w:type="spellStart"/>
+      <w:r>
+        <w:rPr>
+          <w:color w:val="222222"/>
+          <w:sz w:val="21"/>
+          <w:szCs w:val="21"/>
+        </w:rPr>
+        <w:t>dài</w:t>
+      </w:r>
+      <w:proofErr w:type="spellEnd"/>
+      <w:r>
+        <w:rPr>
+          <w:color w:val="222222"/>
+          <w:sz w:val="21"/>
+          <w:szCs w:val="21"/>
+        </w:rPr>
+        <w:t xml:space="preserve"> </w:t>
+      </w:r>
+      <w:proofErr w:type="spellStart"/>
+      <w:r>
+        <w:rPr>
+          <w:color w:val="222222"/>
+          <w:sz w:val="21"/>
+          <w:szCs w:val="21"/>
+        </w:rPr>
+        <w:t>phía</w:t>
+      </w:r>
+      <w:proofErr w:type="spellEnd"/>
+      <w:r>
+        <w:rPr>
+          <w:color w:val="222222"/>
+          <w:sz w:val="21"/>
+          <w:szCs w:val="21"/>
+        </w:rPr>
+        <w:t xml:space="preserve"> </w:t>
+      </w:r>
+      <w:proofErr w:type="spellStart"/>
+      <w:r>
+        <w:rPr>
+          <w:color w:val="222222"/>
+          <w:sz w:val="21"/>
+          <w:szCs w:val="21"/>
+        </w:rPr>
+        <w:t>dưới</w:t>
+      </w:r>
+      <w:proofErr w:type="spellEnd"/>
+      <w:r>
+        <w:rPr>
+          <w:color w:val="222222"/>
+          <w:sz w:val="21"/>
+          <w:szCs w:val="21"/>
+        </w:rPr>
+        <w:t xml:space="preserve"> (</w:t>
+      </w:r>
+      <w:proofErr w:type="spellStart"/>
+      <w:r>
+        <w:rPr>
+          <w:color w:val="222222"/>
+          <w:sz w:val="21"/>
+          <w:szCs w:val="21"/>
+        </w:rPr>
+        <w:t>cuộn</w:t>
+      </w:r>
+      <w:proofErr w:type="spellEnd"/>
+      <w:r>
+        <w:rPr>
+          <w:color w:val="222222"/>
+          <w:sz w:val="21"/>
+          <w:szCs w:val="21"/>
+        </w:rPr>
+        <w:t xml:space="preserve"> </w:t>
+      </w:r>
+      <w:proofErr w:type="spellStart"/>
+      <w:r>
+        <w:rPr>
+          <w:color w:val="222222"/>
+          <w:sz w:val="21"/>
+          <w:szCs w:val="21"/>
+        </w:rPr>
+        <w:t>được</w:t>
+      </w:r>
+      <w:proofErr w:type="spellEnd"/>
+      <w:r>
+        <w:rPr>
+          <w:color w:val="222222"/>
+          <w:sz w:val="21"/>
+          <w:szCs w:val="21"/>
+        </w:rPr>
+        <w:t xml:space="preserve">), </w:t>
+      </w:r>
+      <w:proofErr w:type="spellStart"/>
+      <w:r>
+        <w:rPr>
+          <w:color w:val="222222"/>
+          <w:sz w:val="21"/>
+          <w:szCs w:val="21"/>
+        </w:rPr>
         <w:t>thanh</w:t>
       </w:r>
       <w:proofErr w:type="spellEnd"/>
@@ -1836,7 +1296,61 @@
           <w:sz w:val="21"/>
           <w:szCs w:val="21"/>
         </w:rPr>
-        <w:t xml:space="preserve"> tab bar </w:t>
+        <w:t xml:space="preserve"> '</w:t>
+      </w:r>
+      <w:proofErr w:type="spellStart"/>
+      <w:r>
+        <w:rPr>
+          <w:color w:val="222222"/>
+          <w:sz w:val="21"/>
+          <w:szCs w:val="21"/>
+        </w:rPr>
+        <w:t>Thêm</w:t>
+      </w:r>
+      <w:proofErr w:type="spellEnd"/>
+      <w:r>
+        <w:rPr>
+          <w:color w:val="222222"/>
+          <w:sz w:val="21"/>
+          <w:szCs w:val="21"/>
+        </w:rPr>
+        <w:t xml:space="preserve"> </w:t>
+      </w:r>
+      <w:proofErr w:type="spellStart"/>
+      <w:r>
+        <w:rPr>
+          <w:color w:val="222222"/>
+          <w:sz w:val="21"/>
+          <w:szCs w:val="21"/>
+        </w:rPr>
+        <w:t>vào</w:t>
+      </w:r>
+      <w:proofErr w:type="spellEnd"/>
+      <w:r>
+        <w:rPr>
+          <w:color w:val="222222"/>
+          <w:sz w:val="21"/>
+          <w:szCs w:val="21"/>
+        </w:rPr>
+        <w:t xml:space="preserve"> </w:t>
+      </w:r>
+      <w:proofErr w:type="spellStart"/>
+      <w:r>
+        <w:rPr>
+          <w:color w:val="222222"/>
+          <w:sz w:val="21"/>
+          <w:szCs w:val="21"/>
+        </w:rPr>
+        <w:t>giỏ</w:t>
+      </w:r>
+      <w:proofErr w:type="spellEnd"/>
+      <w:r>
+        <w:rPr>
+          <w:color w:val="222222"/>
+          <w:sz w:val="21"/>
+          <w:szCs w:val="21"/>
+        </w:rPr>
+        <w:t xml:space="preserve">' </w:t>
       </w:r>
       <w:proofErr w:type="spellStart"/>
       <w:r>
@@ -1872,16 +1386,34 @@
           <w:sz w:val="21"/>
           <w:szCs w:val="21"/>
         </w:rPr>
-        <w:t xml:space="preserve"> ở </w:t>
-      </w:r>
-      <w:proofErr w:type="spellStart"/>
-      <w:r>
-        <w:rPr>
-          <w:color w:val="222222"/>
-          <w:sz w:val="21"/>
-          <w:szCs w:val="21"/>
-        </w:rPr>
-        <w:t>đáy</w:t>
+        <w:t xml:space="preserve"> </w:t>
+      </w:r>
+      <w:proofErr w:type="spellStart"/>
+      <w:r>
+        <w:rPr>
+          <w:color w:val="222222"/>
+          <w:sz w:val="21"/>
+          <w:szCs w:val="21"/>
+        </w:rPr>
+        <w:t>dưới</w:t>
+      </w:r>
+      <w:proofErr w:type="spellEnd"/>
+      <w:r>
+        <w:rPr>
+          <w:color w:val="222222"/>
+          <w:sz w:val="21"/>
+          <w:szCs w:val="21"/>
+        </w:rPr>
+        <w:t xml:space="preserve"> </w:t>
+      </w:r>
+      <w:proofErr w:type="spellStart"/>
+      <w:r>
+        <w:rPr>
+          <w:color w:val="222222"/>
+          <w:sz w:val="21"/>
+          <w:szCs w:val="21"/>
+        </w:rPr>
+        <w:t>cùng</w:t>
       </w:r>
       <w:proofErr w:type="spellEnd"/>
       <w:r>
@@ -1918,384 +1450,6 @@
           <w:szCs w:val="21"/>
         </w:rPr>
         <w:t>hình</w:t>
-      </w:r>
-      <w:proofErr w:type="spellEnd"/>
-      <w:r>
-        <w:rPr>
-          <w:color w:val="222222"/>
-          <w:sz w:val="21"/>
-          <w:szCs w:val="21"/>
-        </w:rPr>
-        <w:t xml:space="preserve"> </w:t>
-      </w:r>
-      <w:proofErr w:type="spellStart"/>
-      <w:r>
-        <w:rPr>
-          <w:color w:val="222222"/>
-          <w:sz w:val="21"/>
-          <w:szCs w:val="21"/>
-        </w:rPr>
-        <w:t>gồm</w:t>
-      </w:r>
-      <w:proofErr w:type="spellEnd"/>
-      <w:r>
-        <w:rPr>
-          <w:color w:val="222222"/>
-          <w:sz w:val="21"/>
-          <w:szCs w:val="21"/>
-        </w:rPr>
-        <w:t xml:space="preserve"> 4 </w:t>
-      </w:r>
-      <w:proofErr w:type="spellStart"/>
-      <w:r>
-        <w:rPr>
-          <w:color w:val="222222"/>
-          <w:sz w:val="21"/>
-          <w:szCs w:val="21"/>
-        </w:rPr>
-        <w:t>mục</w:t>
-      </w:r>
-      <w:proofErr w:type="spellEnd"/>
-      <w:r>
-        <w:rPr>
-          <w:color w:val="222222"/>
-          <w:sz w:val="21"/>
-          <w:szCs w:val="21"/>
-        </w:rPr>
-        <w:t xml:space="preserve">: Trang </w:t>
-      </w:r>
-      <w:proofErr w:type="spellStart"/>
-      <w:r>
-        <w:rPr>
-          <w:color w:val="222222"/>
-          <w:sz w:val="21"/>
-          <w:szCs w:val="21"/>
-        </w:rPr>
-        <w:t>chủ</w:t>
-      </w:r>
-      <w:proofErr w:type="spellEnd"/>
-      <w:r>
-        <w:rPr>
-          <w:color w:val="222222"/>
-          <w:sz w:val="21"/>
-          <w:szCs w:val="21"/>
-        </w:rPr>
-        <w:t xml:space="preserve">, </w:t>
-      </w:r>
-      <w:proofErr w:type="spellStart"/>
-      <w:r>
-        <w:rPr>
-          <w:color w:val="222222"/>
-          <w:sz w:val="21"/>
-          <w:szCs w:val="21"/>
-        </w:rPr>
-        <w:t>Danh</w:t>
-      </w:r>
-      <w:proofErr w:type="spellEnd"/>
-      <w:r>
-        <w:rPr>
-          <w:color w:val="222222"/>
-          <w:sz w:val="21"/>
-          <w:szCs w:val="21"/>
-        </w:rPr>
-        <w:t xml:space="preserve"> </w:t>
-      </w:r>
-      <w:proofErr w:type="spellStart"/>
-      <w:r>
-        <w:rPr>
-          <w:color w:val="222222"/>
-          <w:sz w:val="21"/>
-          <w:szCs w:val="21"/>
-        </w:rPr>
-        <w:t>mục</w:t>
-      </w:r>
-      <w:proofErr w:type="spellEnd"/>
-      <w:r>
-        <w:rPr>
-          <w:color w:val="222222"/>
-          <w:sz w:val="21"/>
-          <w:szCs w:val="21"/>
-        </w:rPr>
-        <w:t xml:space="preserve">, </w:t>
-      </w:r>
-      <w:proofErr w:type="spellStart"/>
-      <w:r>
-        <w:rPr>
-          <w:color w:val="222222"/>
-          <w:sz w:val="21"/>
-          <w:szCs w:val="21"/>
-        </w:rPr>
-        <w:t>Giỏ</w:t>
-      </w:r>
-      <w:proofErr w:type="spellEnd"/>
-      <w:r>
-        <w:rPr>
-          <w:color w:val="222222"/>
-          <w:sz w:val="21"/>
-          <w:szCs w:val="21"/>
-        </w:rPr>
-        <w:t xml:space="preserve"> </w:t>
-      </w:r>
-      <w:proofErr w:type="spellStart"/>
-      <w:r>
-        <w:rPr>
-          <w:color w:val="222222"/>
-          <w:sz w:val="21"/>
-          <w:szCs w:val="21"/>
-        </w:rPr>
-        <w:t>hàng</w:t>
-      </w:r>
-      <w:proofErr w:type="spellEnd"/>
-      <w:r>
-        <w:rPr>
-          <w:color w:val="222222"/>
-          <w:sz w:val="21"/>
-          <w:szCs w:val="21"/>
-        </w:rPr>
-        <w:t xml:space="preserve">, </w:t>
-      </w:r>
-      <w:proofErr w:type="spellStart"/>
-      <w:r>
-        <w:rPr>
-          <w:color w:val="222222"/>
-          <w:sz w:val="21"/>
-          <w:szCs w:val="21"/>
-        </w:rPr>
-        <w:t>Tài</w:t>
-      </w:r>
-      <w:proofErr w:type="spellEnd"/>
-      <w:r>
-        <w:rPr>
-          <w:color w:val="222222"/>
-          <w:sz w:val="21"/>
-          <w:szCs w:val="21"/>
-        </w:rPr>
-        <w:t xml:space="preserve"> </w:t>
-      </w:r>
-      <w:proofErr w:type="spellStart"/>
-      <w:r>
-        <w:rPr>
-          <w:color w:val="222222"/>
-          <w:sz w:val="21"/>
-          <w:szCs w:val="21"/>
-        </w:rPr>
-        <w:t>khoản</w:t>
-      </w:r>
-      <w:proofErr w:type="spellEnd"/>
-      <w:r>
-        <w:rPr>
-          <w:color w:val="222222"/>
-          <w:sz w:val="21"/>
-          <w:szCs w:val="21"/>
-        </w:rPr>
-        <w:t xml:space="preserve"> — icon </w:t>
-      </w:r>
-      <w:proofErr w:type="spellStart"/>
-      <w:r>
-        <w:rPr>
-          <w:color w:val="222222"/>
-          <w:sz w:val="21"/>
-          <w:szCs w:val="21"/>
-        </w:rPr>
-        <w:t>phía</w:t>
-      </w:r>
-      <w:proofErr w:type="spellEnd"/>
-      <w:r>
-        <w:rPr>
-          <w:color w:val="222222"/>
-          <w:sz w:val="21"/>
-          <w:szCs w:val="21"/>
-        </w:rPr>
-        <w:t xml:space="preserve"> </w:t>
-      </w:r>
-      <w:proofErr w:type="spellStart"/>
-      <w:r>
-        <w:rPr>
-          <w:color w:val="222222"/>
-          <w:sz w:val="21"/>
-          <w:szCs w:val="21"/>
-        </w:rPr>
-        <w:t>trên</w:t>
-      </w:r>
-      <w:proofErr w:type="spellEnd"/>
-      <w:r>
-        <w:rPr>
-          <w:color w:val="222222"/>
-          <w:sz w:val="21"/>
-          <w:szCs w:val="21"/>
-        </w:rPr>
-        <w:t xml:space="preserve">, </w:t>
-      </w:r>
-      <w:proofErr w:type="spellStart"/>
-      <w:r>
-        <w:rPr>
-          <w:color w:val="222222"/>
-          <w:sz w:val="21"/>
-          <w:szCs w:val="21"/>
-        </w:rPr>
-        <w:t>chữ</w:t>
-      </w:r>
-      <w:proofErr w:type="spellEnd"/>
-      <w:r>
-        <w:rPr>
-          <w:color w:val="222222"/>
-          <w:sz w:val="21"/>
-          <w:szCs w:val="21"/>
-        </w:rPr>
-        <w:t xml:space="preserve"> </w:t>
-      </w:r>
-      <w:proofErr w:type="spellStart"/>
-      <w:r>
-        <w:rPr>
-          <w:color w:val="222222"/>
-          <w:sz w:val="21"/>
-          <w:szCs w:val="21"/>
-        </w:rPr>
-        <w:t>phía</w:t>
-      </w:r>
-      <w:proofErr w:type="spellEnd"/>
-      <w:r>
-        <w:rPr>
-          <w:color w:val="222222"/>
-          <w:sz w:val="21"/>
-          <w:szCs w:val="21"/>
-        </w:rPr>
-        <w:t xml:space="preserve"> </w:t>
-      </w:r>
-      <w:proofErr w:type="spellStart"/>
-      <w:r>
-        <w:rPr>
-          <w:color w:val="222222"/>
-          <w:sz w:val="21"/>
-          <w:szCs w:val="21"/>
-        </w:rPr>
-        <w:t>dưới</w:t>
-      </w:r>
-      <w:proofErr w:type="spellEnd"/>
-      <w:r>
-        <w:rPr>
-          <w:color w:val="222222"/>
-          <w:sz w:val="21"/>
-          <w:szCs w:val="21"/>
-        </w:rPr>
-        <w:t xml:space="preserve">, </w:t>
-      </w:r>
-      <w:proofErr w:type="spellStart"/>
-      <w:r>
-        <w:rPr>
-          <w:color w:val="222222"/>
-          <w:sz w:val="21"/>
-          <w:szCs w:val="21"/>
-        </w:rPr>
-        <w:t>mục</w:t>
-      </w:r>
-      <w:proofErr w:type="spellEnd"/>
-      <w:r>
-        <w:rPr>
-          <w:color w:val="222222"/>
-          <w:sz w:val="21"/>
-          <w:szCs w:val="21"/>
-        </w:rPr>
-        <w:t xml:space="preserve"> </w:t>
-      </w:r>
-      <w:proofErr w:type="spellStart"/>
-      <w:r>
-        <w:rPr>
-          <w:color w:val="222222"/>
-          <w:sz w:val="21"/>
-          <w:szCs w:val="21"/>
-        </w:rPr>
-        <w:t>đang</w:t>
-      </w:r>
-      <w:proofErr w:type="spellEnd"/>
-      <w:r>
-        <w:rPr>
-          <w:color w:val="222222"/>
-          <w:sz w:val="21"/>
-          <w:szCs w:val="21"/>
-        </w:rPr>
-        <w:t xml:space="preserve"> </w:t>
-      </w:r>
-      <w:proofErr w:type="spellStart"/>
-      <w:r>
-        <w:rPr>
-          <w:color w:val="222222"/>
-          <w:sz w:val="21"/>
-          <w:szCs w:val="21"/>
-        </w:rPr>
-        <w:t>chọn</w:t>
-      </w:r>
-      <w:proofErr w:type="spellEnd"/>
-      <w:r>
-        <w:rPr>
-          <w:color w:val="222222"/>
-          <w:sz w:val="21"/>
-          <w:szCs w:val="21"/>
-        </w:rPr>
-        <w:t xml:space="preserve"> </w:t>
-      </w:r>
-      <w:proofErr w:type="spellStart"/>
-      <w:r>
-        <w:rPr>
-          <w:color w:val="222222"/>
-          <w:sz w:val="21"/>
-          <w:szCs w:val="21"/>
-        </w:rPr>
-        <w:t>có</w:t>
-      </w:r>
-      <w:proofErr w:type="spellEnd"/>
-      <w:r>
-        <w:rPr>
-          <w:color w:val="222222"/>
-          <w:sz w:val="21"/>
-          <w:szCs w:val="21"/>
-        </w:rPr>
-        <w:t xml:space="preserve"> </w:t>
-      </w:r>
-      <w:proofErr w:type="spellStart"/>
-      <w:r>
-        <w:rPr>
-          <w:color w:val="222222"/>
-          <w:sz w:val="21"/>
-          <w:szCs w:val="21"/>
-        </w:rPr>
-        <w:t>màu</w:t>
-      </w:r>
-      <w:proofErr w:type="spellEnd"/>
-      <w:r>
-        <w:rPr>
-          <w:color w:val="222222"/>
-          <w:sz w:val="21"/>
-          <w:szCs w:val="21"/>
-        </w:rPr>
-        <w:t xml:space="preserve"> </w:t>
-      </w:r>
-      <w:proofErr w:type="spellStart"/>
-      <w:r>
-        <w:rPr>
-          <w:color w:val="222222"/>
-          <w:sz w:val="21"/>
-          <w:szCs w:val="21"/>
-        </w:rPr>
-        <w:t>nổi</w:t>
-      </w:r>
-      <w:proofErr w:type="spellEnd"/>
-      <w:r>
-        <w:rPr>
-          <w:color w:val="222222"/>
-          <w:sz w:val="21"/>
-          <w:szCs w:val="21"/>
-        </w:rPr>
-        <w:t xml:space="preserve"> </w:t>
-      </w:r>
-      <w:proofErr w:type="spellStart"/>
-      <w:r>
-        <w:rPr>
-          <w:color w:val="222222"/>
-          <w:sz w:val="21"/>
-          <w:szCs w:val="21"/>
-        </w:rPr>
-        <w:t>bật</w:t>
       </w:r>
       <w:proofErr w:type="spellEnd"/>
       <w:r>
@@ -2308,22 +1462,16 @@
       </w:r>
     </w:p>
     <w:p>
-      <w:pPr>
-        <w:rPr>
-          <w:b/>
-          <w:bCs/>
-          <w:sz w:val="26"/>
-          <w:szCs w:val="26"/>
-        </w:rPr>
-      </w:pPr>
-    </w:p>
-    <w:p>
-      <w:r>
+      <w:r>
+        <w:rPr>
+          <w:noProof/>
+        </w:rPr>
+        <w:lastRenderedPageBreak/>
         <w:drawing>
-          <wp:inline distT="0" distB="0" distL="0" distR="0" wp14:anchorId="7496F591" wp14:editId="5E57B8BB">
-            <wp:extent cx="2377646" cy="5067739"/>
-            <wp:effectExtent l="0" t="0" r="3810" b="0"/>
-            <wp:docPr id="1" name="Picture 1"/>
+          <wp:inline distT="0" distB="0" distL="0" distR="0" wp14:anchorId="2AC235FF" wp14:editId="779E53A5">
+            <wp:extent cx="2461473" cy="5044877"/>
+            <wp:effectExtent l="0" t="0" r="0" b="3810"/>
+            <wp:docPr id="4" name="Picture 4"/>
             <wp:cNvGraphicFramePr>
               <a:graphicFrameLocks xmlns:a="http://schemas.openxmlformats.org/drawingml/2006/main" noChangeAspect="1"/>
             </wp:cNvGraphicFramePr>
@@ -2343,6 +1491,886 @@
                   <pic:spPr>
                     <a:xfrm>
                       <a:off x="0" y="0"/>
+                      <a:ext cx="2461473" cy="5044877"/>
+                    </a:xfrm>
+                    <a:prstGeom prst="rect">
+                      <a:avLst/>
+                    </a:prstGeom>
+                  </pic:spPr>
+                </pic:pic>
+              </a:graphicData>
+            </a:graphic>
+          </wp:inline>
+        </w:drawing>
+      </w:r>
+    </w:p>
+    <w:p/>
+    <w:p>
+      <w:r>
+        <w:br w:type="page"/>
+      </w:r>
+    </w:p>
+    <w:p>
+      <w:pPr>
+        <w:rPr>
+          <w:b/>
+          <w:bCs/>
+          <w:sz w:val="26"/>
+          <w:szCs w:val="26"/>
+        </w:rPr>
+      </w:pPr>
+      <w:proofErr w:type="spellStart"/>
+      <w:r>
+        <w:rPr>
+          <w:b/>
+          <w:bCs/>
+          <w:sz w:val="26"/>
+          <w:szCs w:val="26"/>
+        </w:rPr>
+        <w:lastRenderedPageBreak/>
+        <w:t>Giờ</w:t>
+      </w:r>
+      <w:proofErr w:type="spellEnd"/>
+      <w:r>
+        <w:rPr>
+          <w:b/>
+          <w:bCs/>
+          <w:sz w:val="26"/>
+          <w:szCs w:val="26"/>
+        </w:rPr>
+        <w:t xml:space="preserve"> 5 — </w:t>
+      </w:r>
+      <w:proofErr w:type="spellStart"/>
+      <w:r>
+        <w:rPr>
+          <w:b/>
+          <w:bCs/>
+          <w:sz w:val="26"/>
+          <w:szCs w:val="26"/>
+        </w:rPr>
+        <w:t>Tổng</w:t>
+      </w:r>
+      <w:proofErr w:type="spellEnd"/>
+      <w:r>
+        <w:rPr>
+          <w:b/>
+          <w:bCs/>
+          <w:sz w:val="26"/>
+          <w:szCs w:val="26"/>
+        </w:rPr>
+        <w:t xml:space="preserve"> </w:t>
+      </w:r>
+      <w:proofErr w:type="spellStart"/>
+      <w:r>
+        <w:rPr>
+          <w:b/>
+          <w:bCs/>
+          <w:sz w:val="26"/>
+          <w:szCs w:val="26"/>
+        </w:rPr>
+        <w:t>hợp</w:t>
+      </w:r>
+      <w:proofErr w:type="spellEnd"/>
+      <w:r>
+        <w:rPr>
+          <w:b/>
+          <w:bCs/>
+          <w:sz w:val="26"/>
+          <w:szCs w:val="26"/>
+        </w:rPr>
+        <w:t xml:space="preserve">: Bottom Tab Layout &amp; </w:t>
+      </w:r>
+      <w:proofErr w:type="spellStart"/>
+      <w:r>
+        <w:rPr>
+          <w:b/>
+          <w:bCs/>
+          <w:sz w:val="26"/>
+          <w:szCs w:val="26"/>
+        </w:rPr>
+        <w:t>Hoàn</w:t>
+      </w:r>
+      <w:proofErr w:type="spellEnd"/>
+      <w:r>
+        <w:rPr>
+          <w:b/>
+          <w:bCs/>
+          <w:sz w:val="26"/>
+          <w:szCs w:val="26"/>
+        </w:rPr>
+        <w:t xml:space="preserve"> </w:t>
+      </w:r>
+      <w:proofErr w:type="spellStart"/>
+      <w:r>
+        <w:rPr>
+          <w:b/>
+          <w:bCs/>
+          <w:sz w:val="26"/>
+          <w:szCs w:val="26"/>
+        </w:rPr>
+        <w:t>thiện</w:t>
+      </w:r>
+      <w:proofErr w:type="spellEnd"/>
+      <w:r>
+        <w:rPr>
+          <w:b/>
+          <w:bCs/>
+          <w:sz w:val="26"/>
+          <w:szCs w:val="26"/>
+        </w:rPr>
+        <w:t xml:space="preserve"> </w:t>
+      </w:r>
+      <w:proofErr w:type="spellStart"/>
+      <w:r>
+        <w:rPr>
+          <w:b/>
+          <w:bCs/>
+          <w:sz w:val="26"/>
+          <w:szCs w:val="26"/>
+        </w:rPr>
+        <w:t>ứng</w:t>
+      </w:r>
+      <w:proofErr w:type="spellEnd"/>
+      <w:r>
+        <w:rPr>
+          <w:b/>
+          <w:bCs/>
+          <w:sz w:val="26"/>
+          <w:szCs w:val="26"/>
+        </w:rPr>
+        <w:t xml:space="preserve"> </w:t>
+      </w:r>
+      <w:proofErr w:type="spellStart"/>
+      <w:r>
+        <w:rPr>
+          <w:b/>
+          <w:bCs/>
+          <w:sz w:val="26"/>
+          <w:szCs w:val="26"/>
+        </w:rPr>
+        <w:t>dụng</w:t>
+      </w:r>
+      <w:proofErr w:type="spellEnd"/>
+    </w:p>
+    <w:p>
+      <w:pPr>
+        <w:pStyle w:val="NormalWeb"/>
+        <w:spacing w:before="160" w:beforeAutospacing="0" w:after="60" w:afterAutospacing="0"/>
+      </w:pPr>
+      <w:proofErr w:type="spellStart"/>
+      <w:r>
+        <w:rPr>
+          <w:b/>
+          <w:bCs/>
+          <w:color w:val="3F51B5"/>
+          <w:sz w:val="21"/>
+          <w:szCs w:val="21"/>
+        </w:rPr>
+        <w:t>Bài</w:t>
+      </w:r>
+      <w:proofErr w:type="spellEnd"/>
+      <w:r>
+        <w:rPr>
+          <w:b/>
+          <w:bCs/>
+          <w:color w:val="3F51B5"/>
+          <w:sz w:val="21"/>
+          <w:szCs w:val="21"/>
+        </w:rPr>
+        <w:t xml:space="preserve"> </w:t>
+      </w:r>
+      <w:proofErr w:type="spellStart"/>
+      <w:r>
+        <w:rPr>
+          <w:b/>
+          <w:bCs/>
+          <w:color w:val="3F51B5"/>
+          <w:sz w:val="21"/>
+          <w:szCs w:val="21"/>
+        </w:rPr>
+        <w:t>tập</w:t>
+      </w:r>
+      <w:proofErr w:type="spellEnd"/>
+      <w:r>
+        <w:rPr>
+          <w:b/>
+          <w:bCs/>
+          <w:color w:val="3F51B5"/>
+          <w:sz w:val="21"/>
+          <w:szCs w:val="21"/>
+        </w:rPr>
+        <w:t xml:space="preserve"> 1: </w:t>
+      </w:r>
+      <w:r>
+        <w:rPr>
+          <w:b/>
+          <w:bCs/>
+          <w:color w:val="000000"/>
+          <w:sz w:val="21"/>
+          <w:szCs w:val="21"/>
+        </w:rPr>
+        <w:t xml:space="preserve">Thanh Tab Bar </w:t>
+      </w:r>
+      <w:proofErr w:type="spellStart"/>
+      <w:r>
+        <w:rPr>
+          <w:b/>
+          <w:bCs/>
+          <w:color w:val="000000"/>
+          <w:sz w:val="21"/>
+          <w:szCs w:val="21"/>
+        </w:rPr>
+        <w:t>dưới</w:t>
+      </w:r>
+      <w:proofErr w:type="spellEnd"/>
+      <w:r>
+        <w:rPr>
+          <w:b/>
+          <w:bCs/>
+          <w:color w:val="000000"/>
+          <w:sz w:val="21"/>
+          <w:szCs w:val="21"/>
+        </w:rPr>
+        <w:t xml:space="preserve"> </w:t>
+      </w:r>
+      <w:proofErr w:type="spellStart"/>
+      <w:r>
+        <w:rPr>
+          <w:b/>
+          <w:bCs/>
+          <w:color w:val="000000"/>
+          <w:sz w:val="21"/>
+          <w:szCs w:val="21"/>
+        </w:rPr>
+        <w:t>cùng</w:t>
+      </w:r>
+      <w:proofErr w:type="spellEnd"/>
+      <w:r>
+        <w:rPr>
+          <w:b/>
+          <w:bCs/>
+          <w:color w:val="000000"/>
+          <w:sz w:val="21"/>
+          <w:szCs w:val="21"/>
+        </w:rPr>
+        <w:t xml:space="preserve"> (</w:t>
+      </w:r>
+      <w:proofErr w:type="spellStart"/>
+      <w:r>
+        <w:rPr>
+          <w:b/>
+          <w:bCs/>
+          <w:color w:val="000000"/>
+          <w:sz w:val="21"/>
+          <w:szCs w:val="21"/>
+        </w:rPr>
+        <w:t>giao</w:t>
+      </w:r>
+      <w:proofErr w:type="spellEnd"/>
+      <w:r>
+        <w:rPr>
+          <w:b/>
+          <w:bCs/>
+          <w:color w:val="000000"/>
+          <w:sz w:val="21"/>
+          <w:szCs w:val="21"/>
+        </w:rPr>
+        <w:t xml:space="preserve"> </w:t>
+      </w:r>
+      <w:proofErr w:type="spellStart"/>
+      <w:r>
+        <w:rPr>
+          <w:b/>
+          <w:bCs/>
+          <w:color w:val="000000"/>
+          <w:sz w:val="21"/>
+          <w:szCs w:val="21"/>
+        </w:rPr>
+        <w:t>diện</w:t>
+      </w:r>
+      <w:proofErr w:type="spellEnd"/>
+      <w:r>
+        <w:rPr>
+          <w:b/>
+          <w:bCs/>
+          <w:color w:val="000000"/>
+          <w:sz w:val="21"/>
+          <w:szCs w:val="21"/>
+        </w:rPr>
+        <w:t xml:space="preserve"> </w:t>
+      </w:r>
+      <w:proofErr w:type="spellStart"/>
+      <w:r>
+        <w:rPr>
+          <w:b/>
+          <w:bCs/>
+          <w:color w:val="000000"/>
+          <w:sz w:val="21"/>
+          <w:szCs w:val="21"/>
+        </w:rPr>
+        <w:t>tĩnh</w:t>
+      </w:r>
+      <w:proofErr w:type="spellEnd"/>
+      <w:r>
+        <w:rPr>
+          <w:b/>
+          <w:bCs/>
+          <w:color w:val="000000"/>
+          <w:sz w:val="21"/>
+          <w:szCs w:val="21"/>
+        </w:rPr>
+        <w:t>)</w:t>
+      </w:r>
+    </w:p>
+    <w:p>
+      <w:pPr>
+        <w:pStyle w:val="NormalWeb"/>
+        <w:spacing w:before="0" w:beforeAutospacing="0" w:after="120" w:afterAutospacing="0"/>
+      </w:pPr>
+      <w:proofErr w:type="spellStart"/>
+      <w:r>
+        <w:rPr>
+          <w:color w:val="222222"/>
+          <w:sz w:val="21"/>
+          <w:szCs w:val="21"/>
+        </w:rPr>
+        <w:t>Dựng</w:t>
+      </w:r>
+      <w:proofErr w:type="spellEnd"/>
+      <w:r>
+        <w:rPr>
+          <w:color w:val="222222"/>
+          <w:sz w:val="21"/>
+          <w:szCs w:val="21"/>
+        </w:rPr>
+        <w:t xml:space="preserve"> </w:t>
+      </w:r>
+      <w:proofErr w:type="spellStart"/>
+      <w:r>
+        <w:rPr>
+          <w:color w:val="222222"/>
+          <w:sz w:val="21"/>
+          <w:szCs w:val="21"/>
+        </w:rPr>
+        <w:t>thanh</w:t>
+      </w:r>
+      <w:proofErr w:type="spellEnd"/>
+      <w:r>
+        <w:rPr>
+          <w:color w:val="222222"/>
+          <w:sz w:val="21"/>
+          <w:szCs w:val="21"/>
+        </w:rPr>
+        <w:t xml:space="preserve"> tab bar </w:t>
+      </w:r>
+      <w:proofErr w:type="spellStart"/>
+      <w:r>
+        <w:rPr>
+          <w:color w:val="222222"/>
+          <w:sz w:val="21"/>
+          <w:szCs w:val="21"/>
+        </w:rPr>
+        <w:t>cố</w:t>
+      </w:r>
+      <w:proofErr w:type="spellEnd"/>
+      <w:r>
+        <w:rPr>
+          <w:color w:val="222222"/>
+          <w:sz w:val="21"/>
+          <w:szCs w:val="21"/>
+        </w:rPr>
+        <w:t xml:space="preserve"> </w:t>
+      </w:r>
+      <w:proofErr w:type="spellStart"/>
+      <w:r>
+        <w:rPr>
+          <w:color w:val="222222"/>
+          <w:sz w:val="21"/>
+          <w:szCs w:val="21"/>
+        </w:rPr>
+        <w:t>định</w:t>
+      </w:r>
+      <w:proofErr w:type="spellEnd"/>
+      <w:r>
+        <w:rPr>
+          <w:color w:val="222222"/>
+          <w:sz w:val="21"/>
+          <w:szCs w:val="21"/>
+        </w:rPr>
+        <w:t xml:space="preserve"> ở </w:t>
+      </w:r>
+      <w:proofErr w:type="spellStart"/>
+      <w:r>
+        <w:rPr>
+          <w:color w:val="222222"/>
+          <w:sz w:val="21"/>
+          <w:szCs w:val="21"/>
+        </w:rPr>
+        <w:t>đáy</w:t>
+      </w:r>
+      <w:proofErr w:type="spellEnd"/>
+      <w:r>
+        <w:rPr>
+          <w:color w:val="222222"/>
+          <w:sz w:val="21"/>
+          <w:szCs w:val="21"/>
+        </w:rPr>
+        <w:t xml:space="preserve"> </w:t>
+      </w:r>
+      <w:proofErr w:type="spellStart"/>
+      <w:r>
+        <w:rPr>
+          <w:color w:val="222222"/>
+          <w:sz w:val="21"/>
+          <w:szCs w:val="21"/>
+        </w:rPr>
+        <w:t>màn</w:t>
+      </w:r>
+      <w:proofErr w:type="spellEnd"/>
+      <w:r>
+        <w:rPr>
+          <w:color w:val="222222"/>
+          <w:sz w:val="21"/>
+          <w:szCs w:val="21"/>
+        </w:rPr>
+        <w:t xml:space="preserve"> </w:t>
+      </w:r>
+      <w:proofErr w:type="spellStart"/>
+      <w:r>
+        <w:rPr>
+          <w:color w:val="222222"/>
+          <w:sz w:val="21"/>
+          <w:szCs w:val="21"/>
+        </w:rPr>
+        <w:t>hình</w:t>
+      </w:r>
+      <w:proofErr w:type="spellEnd"/>
+      <w:r>
+        <w:rPr>
+          <w:color w:val="222222"/>
+          <w:sz w:val="21"/>
+          <w:szCs w:val="21"/>
+        </w:rPr>
+        <w:t xml:space="preserve"> </w:t>
+      </w:r>
+      <w:proofErr w:type="spellStart"/>
+      <w:r>
+        <w:rPr>
+          <w:color w:val="222222"/>
+          <w:sz w:val="21"/>
+          <w:szCs w:val="21"/>
+        </w:rPr>
+        <w:t>gồm</w:t>
+      </w:r>
+      <w:proofErr w:type="spellEnd"/>
+      <w:r>
+        <w:rPr>
+          <w:color w:val="222222"/>
+          <w:sz w:val="21"/>
+          <w:szCs w:val="21"/>
+        </w:rPr>
+        <w:t xml:space="preserve"> 4 </w:t>
+      </w:r>
+      <w:proofErr w:type="spellStart"/>
+      <w:r>
+        <w:rPr>
+          <w:color w:val="222222"/>
+          <w:sz w:val="21"/>
+          <w:szCs w:val="21"/>
+        </w:rPr>
+        <w:t>mục</w:t>
+      </w:r>
+      <w:proofErr w:type="spellEnd"/>
+      <w:r>
+        <w:rPr>
+          <w:color w:val="222222"/>
+          <w:sz w:val="21"/>
+          <w:szCs w:val="21"/>
+        </w:rPr>
+        <w:t xml:space="preserve">: Trang </w:t>
+      </w:r>
+      <w:proofErr w:type="spellStart"/>
+      <w:r>
+        <w:rPr>
+          <w:color w:val="222222"/>
+          <w:sz w:val="21"/>
+          <w:szCs w:val="21"/>
+        </w:rPr>
+        <w:t>chủ</w:t>
+      </w:r>
+      <w:proofErr w:type="spellEnd"/>
+      <w:r>
+        <w:rPr>
+          <w:color w:val="222222"/>
+          <w:sz w:val="21"/>
+          <w:szCs w:val="21"/>
+        </w:rPr>
+        <w:t xml:space="preserve">, </w:t>
+      </w:r>
+      <w:proofErr w:type="spellStart"/>
+      <w:r>
+        <w:rPr>
+          <w:color w:val="222222"/>
+          <w:sz w:val="21"/>
+          <w:szCs w:val="21"/>
+        </w:rPr>
+        <w:t>Danh</w:t>
+      </w:r>
+      <w:proofErr w:type="spellEnd"/>
+      <w:r>
+        <w:rPr>
+          <w:color w:val="222222"/>
+          <w:sz w:val="21"/>
+          <w:szCs w:val="21"/>
+        </w:rPr>
+        <w:t xml:space="preserve"> </w:t>
+      </w:r>
+      <w:proofErr w:type="spellStart"/>
+      <w:r>
+        <w:rPr>
+          <w:color w:val="222222"/>
+          <w:sz w:val="21"/>
+          <w:szCs w:val="21"/>
+        </w:rPr>
+        <w:t>mục</w:t>
+      </w:r>
+      <w:proofErr w:type="spellEnd"/>
+      <w:r>
+        <w:rPr>
+          <w:color w:val="222222"/>
+          <w:sz w:val="21"/>
+          <w:szCs w:val="21"/>
+        </w:rPr>
+        <w:t xml:space="preserve">, </w:t>
+      </w:r>
+      <w:proofErr w:type="spellStart"/>
+      <w:r>
+        <w:rPr>
+          <w:color w:val="222222"/>
+          <w:sz w:val="21"/>
+          <w:szCs w:val="21"/>
+        </w:rPr>
+        <w:t>Giỏ</w:t>
+      </w:r>
+      <w:proofErr w:type="spellEnd"/>
+      <w:r>
+        <w:rPr>
+          <w:color w:val="222222"/>
+          <w:sz w:val="21"/>
+          <w:szCs w:val="21"/>
+        </w:rPr>
+        <w:t xml:space="preserve"> </w:t>
+      </w:r>
+      <w:proofErr w:type="spellStart"/>
+      <w:r>
+        <w:rPr>
+          <w:color w:val="222222"/>
+          <w:sz w:val="21"/>
+          <w:szCs w:val="21"/>
+        </w:rPr>
+        <w:t>hàng</w:t>
+      </w:r>
+      <w:proofErr w:type="spellEnd"/>
+      <w:r>
+        <w:rPr>
+          <w:color w:val="222222"/>
+          <w:sz w:val="21"/>
+          <w:szCs w:val="21"/>
+        </w:rPr>
+        <w:t xml:space="preserve">, </w:t>
+      </w:r>
+      <w:proofErr w:type="spellStart"/>
+      <w:r>
+        <w:rPr>
+          <w:color w:val="222222"/>
+          <w:sz w:val="21"/>
+          <w:szCs w:val="21"/>
+        </w:rPr>
+        <w:t>Tài</w:t>
+      </w:r>
+      <w:proofErr w:type="spellEnd"/>
+      <w:r>
+        <w:rPr>
+          <w:color w:val="222222"/>
+          <w:sz w:val="21"/>
+          <w:szCs w:val="21"/>
+        </w:rPr>
+        <w:t xml:space="preserve"> </w:t>
+      </w:r>
+      <w:proofErr w:type="spellStart"/>
+      <w:r>
+        <w:rPr>
+          <w:color w:val="222222"/>
+          <w:sz w:val="21"/>
+          <w:szCs w:val="21"/>
+        </w:rPr>
+        <w:t>khoản</w:t>
+      </w:r>
+      <w:proofErr w:type="spellEnd"/>
+      <w:r>
+        <w:rPr>
+          <w:color w:val="222222"/>
+          <w:sz w:val="21"/>
+          <w:szCs w:val="21"/>
+        </w:rPr>
+        <w:t xml:space="preserve"> — icon </w:t>
+      </w:r>
+      <w:proofErr w:type="spellStart"/>
+      <w:r>
+        <w:rPr>
+          <w:color w:val="222222"/>
+          <w:sz w:val="21"/>
+          <w:szCs w:val="21"/>
+        </w:rPr>
+        <w:t>phía</w:t>
+      </w:r>
+      <w:proofErr w:type="spellEnd"/>
+      <w:r>
+        <w:rPr>
+          <w:color w:val="222222"/>
+          <w:sz w:val="21"/>
+          <w:szCs w:val="21"/>
+        </w:rPr>
+        <w:t xml:space="preserve"> </w:t>
+      </w:r>
+      <w:proofErr w:type="spellStart"/>
+      <w:r>
+        <w:rPr>
+          <w:color w:val="222222"/>
+          <w:sz w:val="21"/>
+          <w:szCs w:val="21"/>
+        </w:rPr>
+        <w:t>trên</w:t>
+      </w:r>
+      <w:proofErr w:type="spellEnd"/>
+      <w:r>
+        <w:rPr>
+          <w:color w:val="222222"/>
+          <w:sz w:val="21"/>
+          <w:szCs w:val="21"/>
+        </w:rPr>
+        <w:t xml:space="preserve">, </w:t>
+      </w:r>
+      <w:proofErr w:type="spellStart"/>
+      <w:r>
+        <w:rPr>
+          <w:color w:val="222222"/>
+          <w:sz w:val="21"/>
+          <w:szCs w:val="21"/>
+        </w:rPr>
+        <w:t>chữ</w:t>
+      </w:r>
+      <w:proofErr w:type="spellEnd"/>
+      <w:r>
+        <w:rPr>
+          <w:color w:val="222222"/>
+          <w:sz w:val="21"/>
+          <w:szCs w:val="21"/>
+        </w:rPr>
+        <w:t xml:space="preserve"> </w:t>
+      </w:r>
+      <w:proofErr w:type="spellStart"/>
+      <w:r>
+        <w:rPr>
+          <w:color w:val="222222"/>
+          <w:sz w:val="21"/>
+          <w:szCs w:val="21"/>
+        </w:rPr>
+        <w:t>phía</w:t>
+      </w:r>
+      <w:proofErr w:type="spellEnd"/>
+      <w:r>
+        <w:rPr>
+          <w:color w:val="222222"/>
+          <w:sz w:val="21"/>
+          <w:szCs w:val="21"/>
+        </w:rPr>
+        <w:t xml:space="preserve"> </w:t>
+      </w:r>
+      <w:proofErr w:type="spellStart"/>
+      <w:r>
+        <w:rPr>
+          <w:color w:val="222222"/>
+          <w:sz w:val="21"/>
+          <w:szCs w:val="21"/>
+        </w:rPr>
+        <w:t>dưới</w:t>
+      </w:r>
+      <w:proofErr w:type="spellEnd"/>
+      <w:r>
+        <w:rPr>
+          <w:color w:val="222222"/>
+          <w:sz w:val="21"/>
+          <w:szCs w:val="21"/>
+        </w:rPr>
+        <w:t xml:space="preserve">, </w:t>
+      </w:r>
+      <w:proofErr w:type="spellStart"/>
+      <w:r>
+        <w:rPr>
+          <w:color w:val="222222"/>
+          <w:sz w:val="21"/>
+          <w:szCs w:val="21"/>
+        </w:rPr>
+        <w:t>mục</w:t>
+      </w:r>
+      <w:proofErr w:type="spellEnd"/>
+      <w:r>
+        <w:rPr>
+          <w:color w:val="222222"/>
+          <w:sz w:val="21"/>
+          <w:szCs w:val="21"/>
+        </w:rPr>
+        <w:t xml:space="preserve"> </w:t>
+      </w:r>
+      <w:proofErr w:type="spellStart"/>
+      <w:r>
+        <w:rPr>
+          <w:color w:val="222222"/>
+          <w:sz w:val="21"/>
+          <w:szCs w:val="21"/>
+        </w:rPr>
+        <w:t>đang</w:t>
+      </w:r>
+      <w:proofErr w:type="spellEnd"/>
+      <w:r>
+        <w:rPr>
+          <w:color w:val="222222"/>
+          <w:sz w:val="21"/>
+          <w:szCs w:val="21"/>
+        </w:rPr>
+        <w:t xml:space="preserve"> </w:t>
+      </w:r>
+      <w:proofErr w:type="spellStart"/>
+      <w:r>
+        <w:rPr>
+          <w:color w:val="222222"/>
+          <w:sz w:val="21"/>
+          <w:szCs w:val="21"/>
+        </w:rPr>
+        <w:t>chọn</w:t>
+      </w:r>
+      <w:proofErr w:type="spellEnd"/>
+      <w:r>
+        <w:rPr>
+          <w:color w:val="222222"/>
+          <w:sz w:val="21"/>
+          <w:szCs w:val="21"/>
+        </w:rPr>
+        <w:t xml:space="preserve"> </w:t>
+      </w:r>
+      <w:proofErr w:type="spellStart"/>
+      <w:r>
+        <w:rPr>
+          <w:color w:val="222222"/>
+          <w:sz w:val="21"/>
+          <w:szCs w:val="21"/>
+        </w:rPr>
+        <w:t>có</w:t>
+      </w:r>
+      <w:proofErr w:type="spellEnd"/>
+      <w:r>
+        <w:rPr>
+          <w:color w:val="222222"/>
+          <w:sz w:val="21"/>
+          <w:szCs w:val="21"/>
+        </w:rPr>
+        <w:t xml:space="preserve"> </w:t>
+      </w:r>
+      <w:proofErr w:type="spellStart"/>
+      <w:r>
+        <w:rPr>
+          <w:color w:val="222222"/>
+          <w:sz w:val="21"/>
+          <w:szCs w:val="21"/>
+        </w:rPr>
+        <w:t>màu</w:t>
+      </w:r>
+      <w:proofErr w:type="spellEnd"/>
+      <w:r>
+        <w:rPr>
+          <w:color w:val="222222"/>
+          <w:sz w:val="21"/>
+          <w:szCs w:val="21"/>
+        </w:rPr>
+        <w:t xml:space="preserve"> </w:t>
+      </w:r>
+      <w:proofErr w:type="spellStart"/>
+      <w:r>
+        <w:rPr>
+          <w:color w:val="222222"/>
+          <w:sz w:val="21"/>
+          <w:szCs w:val="21"/>
+        </w:rPr>
+        <w:t>nổi</w:t>
+      </w:r>
+      <w:proofErr w:type="spellEnd"/>
+      <w:r>
+        <w:rPr>
+          <w:color w:val="222222"/>
+          <w:sz w:val="21"/>
+          <w:szCs w:val="21"/>
+        </w:rPr>
+        <w:t xml:space="preserve"> </w:t>
+      </w:r>
+      <w:proofErr w:type="spellStart"/>
+      <w:r>
+        <w:rPr>
+          <w:color w:val="222222"/>
+          <w:sz w:val="21"/>
+          <w:szCs w:val="21"/>
+        </w:rPr>
+        <w:t>bật</w:t>
+      </w:r>
+      <w:proofErr w:type="spellEnd"/>
+      <w:r>
+        <w:rPr>
+          <w:color w:val="222222"/>
+          <w:sz w:val="21"/>
+          <w:szCs w:val="21"/>
+        </w:rPr>
+        <w:t>.</w:t>
+      </w:r>
+    </w:p>
+    <w:p>
+      <w:pPr>
+        <w:rPr>
+          <w:b/>
+          <w:bCs/>
+          <w:sz w:val="26"/>
+          <w:szCs w:val="26"/>
+        </w:rPr>
+      </w:pPr>
+    </w:p>
+    <w:p>
+      <w:r>
+        <w:rPr>
+          <w:noProof/>
+        </w:rPr>
+        <w:drawing>
+          <wp:inline distT="0" distB="0" distL="0" distR="0" wp14:anchorId="7496F591" wp14:editId="5E57B8BB">
+            <wp:extent cx="2377646" cy="5067739"/>
+            <wp:effectExtent l="0" t="0" r="3810" b="0"/>
+            <wp:docPr id="1" name="Picture 1"/>
+            <wp:cNvGraphicFramePr>
+              <a:graphicFrameLocks xmlns:a="http://schemas.openxmlformats.org/drawingml/2006/main" noChangeAspect="1"/>
+            </wp:cNvGraphicFramePr>
+            <a:graphic xmlns:a="http://schemas.openxmlformats.org/drawingml/2006/main">
+              <a:graphicData uri="http://schemas.openxmlformats.org/drawingml/2006/picture">
+                <pic:pic xmlns:pic="http://schemas.openxmlformats.org/drawingml/2006/picture">
+                  <pic:nvPicPr>
+                    <pic:cNvPr id="1" name=""/>
+                    <pic:cNvPicPr/>
+                  </pic:nvPicPr>
+                  <pic:blipFill>
+                    <a:blip r:embed="rId7"/>
+                    <a:stretch>
+                      <a:fillRect/>
+                    </a:stretch>
+                  </pic:blipFill>
+                  <pic:spPr>
+                    <a:xfrm>
+                      <a:off x="0" y="0"/>
                       <a:ext cx="2377646" cy="5067739"/>
                     </a:xfrm>
                     <a:prstGeom prst="rect">
@@ -3161,6 +3189,9 @@
     </w:p>
     <w:p>
       <w:r>
+        <w:rPr>
+          <w:noProof/>
+        </w:rPr>
         <w:lastRenderedPageBreak/>
         <w:drawing>
           <wp:inline distT="0" distB="0" distL="0" distR="0" wp14:anchorId="7CA731A7" wp14:editId="3528E029">
@@ -3178,7 +3209,7 @@
                     <pic:cNvPicPr/>
                   </pic:nvPicPr>
                   <pic:blipFill>
-                    <a:blip r:embed="rId7"/>
+                    <a:blip r:embed="rId8"/>
                     <a:stretch>
                       <a:fillRect/>
                     </a:stretch>

</xml_diff>